<commit_message>
docs: add GitHub repository screenshot to README and report
Co-Authored-By: Claude Opus 5.5 <noreply@anthropic.com>
</commit_message>
<xml_diff>
--- a/report/AAT1_Report.docx
+++ b/report/AAT1_Report.docx
@@ -4589,17 +4589,48 @@
     </w:p>
     <w:p>
       <w:pPr>
-        <w:spacing w:after="160" w:line="276"/>
-      </w:pPr>
-      <w:r>
-        <w:rPr>
-          <w:rFonts w:ascii="Segoe UI" w:cs="Segoe UI" w:eastAsia="Segoe UI" w:hAnsi="Segoe UI"/>
-          <w:i/>
-          <w:iCs/>
-          <w:sz w:val="21"/>
-          <w:szCs w:val="21"/>
-        </w:rPr>
-        <w:t xml:space="preserve">[Insert screenshot]</w:t>
+        <w:spacing w:after="240"/>
+        <w:jc w:val="center"/>
+      </w:pPr>
+      <w:r>
+        <w:drawing>
+          <wp:inline distT="0" distB="0" distL="0" distR="0">
+            <wp:extent cx="4762500" cy="2981325"/>
+            <wp:effectExtent t="0" r="0" b="0" l="0"/>
+            <wp:docPr id="11" name="github-repo.png" descr="github-repo.png" title="github-repo.png"/>
+            <wp:cNvGraphicFramePr>
+              <a:graphicFrameLocks xmlns:a="http://schemas.openxmlformats.org/drawingml/2006/main" noChangeAspect="1"/>
+            </wp:cNvGraphicFramePr>
+            <a:graphic xmlns:a="http://schemas.openxmlformats.org/drawingml/2006/main">
+              <a:graphicData uri="http://schemas.openxmlformats.org/drawingml/2006/picture">
+                <pic:pic xmlns:pic="http://schemas.openxmlformats.org/drawingml/2006/picture">
+                  <pic:nvPicPr>
+                    <pic:cNvPr id="0" name="" descr=""/>
+                    <pic:cNvPicPr>
+                      <a:picLocks noChangeAspect="1" noChangeArrowheads="1"/>
+                    </pic:cNvPicPr>
+                  </pic:nvPicPr>
+                  <pic:blipFill>
+                    <a:blip r:embed="rId18" cstate="none"/>
+                    <a:srcRect/>
+                    <a:stretch>
+                      <a:fillRect/>
+                    </a:stretch>
+                  </pic:blipFill>
+                  <pic:spPr bwMode="auto">
+                    <a:xfrm>
+                      <a:off x="0" y="0"/>
+                      <a:ext cx="4762500" cy="2981325"/>
+                    </a:xfrm>
+                    <a:prstGeom prst="rect">
+                      <a:avLst/>
+                    </a:prstGeom>
+                  </pic:spPr>
+                </pic:pic>
+              </a:graphicData>
+            </a:graphic>
+          </wp:inline>
+        </w:drawing>
       </w:r>
     </w:p>
     <w:p>
@@ -4985,6 +5016,7 @@
     </w:p>
     <w:p>
       <w:pPr>
+        <w:keepNext/>
         <w:spacing w:after="160" w:line="276"/>
       </w:pPr>
       <w:r>
@@ -4998,6 +5030,7 @@
     </w:p>
     <w:p>
       <w:pPr>
+        <w:keepNext/>
         <w:spacing w:after="280"/>
       </w:pPr>
       <w:r>
@@ -5021,6 +5054,7 @@
     </w:p>
     <w:p>
       <w:pPr>
+        <w:keepNext/>
         <w:spacing w:after="280"/>
       </w:pPr>
       <w:r>

</xml_diff>

<commit_message>
feat(ui): playful landing page and Tagby mascot
Co-Authored-By: Claude Opus 5.5 <noreply@anthropic.com>
</commit_message>
<xml_diff>
--- a/report/AAT1_Report.docx
+++ b/report/AAT1_Report.docx
@@ -877,7 +877,7 @@
                 <w:sz w:val="20"/>
                 <w:szCs w:val="20"/>
               </w:rPr>
-              <w:t xml:space="preserve">Utility-first styling kept inside small, replaceable components.</w:t>
+              <w:t xml:space="preserve">Utility-first styling kept inside small, replaceable components; design tokens in one CSS file.</w:t>
             </w:r>
           </w:p>
         </w:tc>
@@ -910,6 +910,92 @@
                 <w:szCs w:val="20"/>
               </w:rPr>
               <w:t xml:space="preserve">5</w:t>
+            </w:r>
+          </w:p>
+        </w:tc>
+        <w:tc>
+          <w:tcPr>
+            <w:tcW w:type="dxa" w:w="2700"/>
+            <w:tcBorders>
+              <w:top w:val="none" w:color="FFFFFF" w:sz="0"/>
+              <w:left w:val="none" w:color="FFFFFF" w:sz="0"/>
+              <w:bottom w:val="single" w:color="BFBFBF" w:sz="4"/>
+              <w:right w:val="none" w:color="FFFFFF" w:sz="0"/>
+            </w:tcBorders>
+            <w:tcMar>
+              <w:top w:type="dxa" w:w="80"/>
+              <w:left w:type="dxa" w:w="100"/>
+              <w:bottom w:type="dxa" w:w="80"/>
+              <w:right w:type="dxa" w:w="100"/>
+            </w:tcMar>
+          </w:tcPr>
+          <w:p>
+            <w:r>
+              <w:rPr>
+                <w:rFonts w:ascii="Segoe UI" w:cs="Segoe UI" w:eastAsia="Segoe UI" w:hAnsi="Segoe UI"/>
+                <w:sz w:val="20"/>
+                <w:szCs w:val="20"/>
+              </w:rPr>
+              <w:t xml:space="preserve">Fontsource (Epilogue 900, DM Sans 400)</w:t>
+            </w:r>
+          </w:p>
+        </w:tc>
+        <w:tc>
+          <w:tcPr>
+            <w:tcW w:type="dxa" w:w="5440"/>
+            <w:tcBorders>
+              <w:top w:val="none" w:color="FFFFFF" w:sz="0"/>
+              <w:left w:val="none" w:color="FFFFFF" w:sz="0"/>
+              <w:bottom w:val="single" w:color="BFBFBF" w:sz="4"/>
+              <w:right w:val="none" w:color="FFFFFF" w:sz="0"/>
+            </w:tcBorders>
+            <w:tcMar>
+              <w:top w:type="dxa" w:w="80"/>
+              <w:left w:type="dxa" w:w="100"/>
+              <w:bottom w:type="dxa" w:w="80"/>
+              <w:right w:type="dxa" w:w="100"/>
+            </w:tcMar>
+          </w:tcPr>
+          <w:p>
+            <w:r>
+              <w:rPr>
+                <w:rFonts w:ascii="Segoe UI" w:cs="Segoe UI" w:eastAsia="Segoe UI" w:hAnsi="Segoe UI"/>
+                <w:sz w:val="20"/>
+                <w:szCs w:val="20"/>
+              </w:rPr>
+              <w:t xml:space="preserve">Self-hosted web fonts for the playful landing page and the rest of the interface.</w:t>
+            </w:r>
+          </w:p>
+        </w:tc>
+      </w:tr>
+      <w:tr>
+        <w:trPr>
+          <w:cantSplit/>
+        </w:trPr>
+        <w:tc>
+          <w:tcPr>
+            <w:tcW w:type="dxa" w:w="1000"/>
+            <w:tcBorders>
+              <w:top w:val="none" w:color="FFFFFF" w:sz="0"/>
+              <w:left w:val="none" w:color="FFFFFF" w:sz="0"/>
+              <w:bottom w:val="single" w:color="BFBFBF" w:sz="4"/>
+              <w:right w:val="none" w:color="FFFFFF" w:sz="0"/>
+            </w:tcBorders>
+            <w:tcMar>
+              <w:top w:type="dxa" w:w="80"/>
+              <w:left w:type="dxa" w:w="100"/>
+              <w:bottom w:type="dxa" w:w="80"/>
+              <w:right w:type="dxa" w:w="100"/>
+            </w:tcMar>
+          </w:tcPr>
+          <w:p>
+            <w:r>
+              <w:rPr>
+                <w:rFonts w:ascii="Segoe UI" w:cs="Segoe UI" w:eastAsia="Segoe UI" w:hAnsi="Segoe UI"/>
+                <w:sz w:val="20"/>
+                <w:szCs w:val="20"/>
+              </w:rPr>
+              <w:t xml:space="preserve">6</w:t>
             </w:r>
           </w:p>
         </w:tc>
@@ -995,7 +1081,7 @@
                 <w:sz w:val="20"/>
                 <w:szCs w:val="20"/>
               </w:rPr>
-              <w:t xml:space="preserve">6</w:t>
+              <w:t xml:space="preserve">7</w:t>
             </w:r>
           </w:p>
         </w:tc>
@@ -1081,7 +1167,7 @@
                 <w:sz w:val="20"/>
                 <w:szCs w:val="20"/>
               </w:rPr>
-              <w:t xml:space="preserve">7</w:t>
+              <w:t xml:space="preserve">8</w:t>
             </w:r>
           </w:p>
         </w:tc>
@@ -1167,7 +1253,7 @@
                 <w:sz w:val="20"/>
                 <w:szCs w:val="20"/>
               </w:rPr>
-              <w:t xml:space="preserve">8</w:t>
+              <w:t xml:space="preserve">9</w:t>
             </w:r>
           </w:p>
         </w:tc>
@@ -1253,7 +1339,7 @@
                 <w:sz w:val="20"/>
                 <w:szCs w:val="20"/>
               </w:rPr>
-              <w:t xml:space="preserve">9</w:t>
+              <w:t xml:space="preserve">10</w:t>
             </w:r>
           </w:p>
         </w:tc>
@@ -1339,7 +1425,7 @@
                 <w:sz w:val="20"/>
                 <w:szCs w:val="20"/>
               </w:rPr>
-              <w:t xml:space="preserve">10</w:t>
+              <w:t xml:space="preserve">11</w:t>
             </w:r>
           </w:p>
         </w:tc>
@@ -1425,7 +1511,7 @@
                 <w:sz w:val="20"/>
                 <w:szCs w:val="20"/>
               </w:rPr>
-              <w:t xml:space="preserve">11</w:t>
+              <w:t xml:space="preserve">12</w:t>
             </w:r>
           </w:p>
         </w:tc>
@@ -1511,7 +1597,7 @@
                 <w:sz w:val="20"/>
                 <w:szCs w:val="20"/>
               </w:rPr>
-              <w:t xml:space="preserve">12</w:t>
+              <w:t xml:space="preserve">13</w:t>
             </w:r>
           </w:p>
         </w:tc>
@@ -1597,7 +1683,7 @@
                 <w:sz w:val="20"/>
                 <w:szCs w:val="20"/>
               </w:rPr>
-              <w:t xml:space="preserve">13</w:t>
+              <w:t xml:space="preserve">14</w:t>
             </w:r>
           </w:p>
         </w:tc>
@@ -1683,7 +1769,7 @@
                 <w:sz w:val="20"/>
                 <w:szCs w:val="20"/>
               </w:rPr>
-              <w:t xml:space="preserve">14</w:t>
+              <w:t xml:space="preserve">15</w:t>
             </w:r>
           </w:p>
         </w:tc>
@@ -1769,7 +1855,7 @@
                 <w:sz w:val="20"/>
                 <w:szCs w:val="20"/>
               </w:rPr>
-              <w:t xml:space="preserve">15</w:t>
+              <w:t xml:space="preserve">16</w:t>
             </w:r>
           </w:p>
         </w:tc>
@@ -1889,6 +1975,19 @@
           <w:sz w:val="21"/>
           <w:szCs w:val="21"/>
         </w:rPr>
+        <w:t xml:space="preserve">The interface is presented through a playful, minimal landing page and an original animated mascot, Tagby: a plush luggage tag drawn entirely in SVG. Tagby's pupils follow the visitor's pointer, it bobs, blinks and glances around when idle, and its mood reflects the state of a tag: happy when an item is safe, worried when it is reported lost and celebrating when it has been found or when a finder has just sent a message. The mascot also appears on the empty dashboard and on the page shown for unknown tag codes, and all of its motion is disabled for users who request reduced motion.</w:t>
+      </w:r>
+    </w:p>
+    <w:p>
+      <w:pPr>
+        <w:spacing w:after="160" w:line="276"/>
+      </w:pPr>
+      <w:r>
+        <w:rPr>
+          <w:rFonts w:ascii="Segoe UI" w:cs="Segoe UI" w:eastAsia="Segoe UI" w:hAnsi="Segoe UI"/>
+          <w:sz w:val="21"/>
+          <w:szCs w:val="21"/>
+        </w:rPr>
         <w:t xml:space="preserve">The application runs entirely on the local machine: data is stored in a SQLite database and uploaded photos in a local folder, and no external accounts or cloud services are required. The expected outcome is a working, tested prototype showing that anonymous two-way communication between owner and finder can be achieved with standard web technologies and a carefully designed data-access layer.</w:t>
       </w:r>
     </w:p>
@@ -2111,7 +2210,7 @@
           <w:sz w:val="21"/>
           <w:szCs w:val="21"/>
         </w:rPr>
-        <w:t xml:space="preserve">Testing, screenshots and delivery. Twenty-five Vitest unit tests cover code generation (including uniqueness over 10,000 codes), token hashing, zod schemas, the rate limiter, status transitions and owner access control on a temporary database. A Playwright smoke test logs in as the seeded demo user, creates a tag, downloads its PDF, sends a message from an anonymous browser context, replies as the owner and confirms that the reply appears in the finder's chat. An idempotent seed script creates clearly marked demo data. A screenshot script builds the app, starts it on a free port and captures every page used in this report. The README documents setup, architecture, the privacy model and design decisions. The project was originally planned around a hosted database and cloud deployment, but was deliberately changed to run fully on localhost, so deployment is listed as future work.</w:t>
+        <w:t xml:space="preserve">Testing, screenshots and delivery. Thirty Vitest unit tests cover code generation (including uniqueness over 10,000 codes), token hashing, zod schemas, the rate limiter, status transitions, owner access control on a temporary database and the mascot's eye-tracking maths. A Playwright smoke test logs in as the seeded demo user, creates a tag, downloads its PDF, sends a message from an anonymous browser context, replies as the owner and confirms that the reply appears in the finder's chat. An idempotent seed script creates clearly marked demo data. A screenshot script builds the app, starts it on a free port and captures every page used in this report. The README documents setup, architecture, the privacy model and design decisions. The project was originally planned around a hosted database and cloud deployment, but was deliberately changed to run fully on localhost, so deployment is listed as future work. Finally, the landing page was restyled in a playful 'creative studio' style (design language adapted from the motionsites.ai 'Playful Idea' template) and the Tagby mascot was added, with design tokens and self-hosted fonts shared by the whole interface.</w:t>
       </w:r>
     </w:p>
     <w:p>
@@ -2148,7 +2247,7 @@
           <w:sz w:val="21"/>
           <w:szCs w:val="21"/>
         </w:rPr>
-        <w:t xml:space="preserve">The following snippets are taken directly from the repository and show the core privacy, security and export mechanisms.</w:t>
+        <w:t xml:space="preserve">The following snippets are taken directly from the repository and show the core privacy, security, export and animation mechanisms.</w:t>
       </w:r>
     </w:p>
     <w:p>
@@ -3861,6 +3960,598 @@
     </w:p>
     <w:p>
       <w:pPr>
+        <w:keepNext/>
+        <w:spacing w:after="60" w:before="240"/>
+      </w:pPr>
+      <w:r>
+        <w:rPr>
+          <w:rFonts w:ascii="Segoe UI" w:cs="Segoe UI" w:eastAsia="Segoe UI" w:hAnsi="Segoe UI"/>
+          <w:b/>
+          <w:bCs/>
+          <w:sz w:val="21"/>
+          <w:szCs w:val="21"/>
+        </w:rPr>
+        <w:t xml:space="preserve">Code Snippet 5:</w:t>
+      </w:r>
+      <w:r>
+        <w:rPr>
+          <w:rFonts w:ascii="Segoe UI" w:cs="Segoe UI" w:eastAsia="Segoe UI" w:hAnsi="Segoe UI"/>
+          <w:sz w:val="21"/>
+          <w:szCs w:val="21"/>
+        </w:rPr>
+        <w:t xml:space="preserve"> Tagby eye tracking (vector → clamp → lerp)</w:t>
+      </w:r>
+    </w:p>
+    <w:p>
+      <w:pPr>
+        <w:keepNext/>
+        <w:spacing w:after="60" w:before="60"/>
+      </w:pPr>
+      <w:r>
+        <w:rPr>
+          <w:rFonts w:ascii="Segoe UI" w:cs="Segoe UI" w:eastAsia="Segoe UI" w:hAnsi="Segoe UI"/>
+          <w:i/>
+          <w:iCs/>
+          <w:color w:val="555555"/>
+          <w:sz w:val="18"/>
+          <w:szCs w:val="18"/>
+        </w:rPr>
+        <w:t xml:space="preserve">lib/eyeTracking.ts and components/mascot/Tagby.tsx</w:t>
+      </w:r>
+    </w:p>
+    <w:p>
+      <w:pPr>
+        <w:keepNext/>
+        <w:keepLines/>
+        <w:pBdr>
+          <w:top w:val="single" w:color="D1D5DB" w:sz="4" w:space="4"/>
+          <w:left w:val="single" w:color="D1D5DB" w:sz="4" w:space="4"/>
+          <w:right w:val="single" w:color="D1D5DB" w:sz="4" w:space="4"/>
+        </w:pBdr>
+        <w:shd w:fill="F3F4F6" w:color="auto" w:val="clear"/>
+        <w:spacing w:after="0" w:line="240"/>
+      </w:pPr>
+      <w:r>
+        <w:rPr>
+          <w:rFonts w:ascii="Consolas" w:cs="Consolas" w:eastAsia="Consolas" w:hAnsi="Consolas"/>
+          <w:sz w:val="15"/>
+          <w:szCs w:val="15"/>
+        </w:rPr>
+        <w:t xml:space="preserve">export function pupilTarget(eye: Vec, pointer: Vec, pxPerUnit: number, eyeRadius: number, ratio = 0.35): Vec {</w:t>
+      </w:r>
+    </w:p>
+    <w:p>
+      <w:pPr>
+        <w:keepNext/>
+        <w:keepLines/>
+        <w:pBdr>
+          <w:left w:val="single" w:color="D1D5DB" w:sz="4" w:space="4"/>
+          <w:right w:val="single" w:color="D1D5DB" w:sz="4" w:space="4"/>
+        </w:pBdr>
+        <w:shd w:fill="F3F4F6" w:color="auto" w:val="clear"/>
+        <w:spacing w:after="0" w:line="240"/>
+      </w:pPr>
+      <w:r>
+        <w:rPr>
+          <w:rFonts w:ascii="Consolas" w:cs="Consolas" w:eastAsia="Consolas" w:hAnsi="Consolas"/>
+          <w:sz w:val="15"/>
+          <w:szCs w:val="15"/>
+        </w:rPr>
+        <w:t xml:space="preserve">  const dx = (pointer.x - eye.x) / pxPerUnit;</w:t>
+      </w:r>
+    </w:p>
+    <w:p>
+      <w:pPr>
+        <w:keepNext/>
+        <w:keepLines/>
+        <w:pBdr>
+          <w:left w:val="single" w:color="D1D5DB" w:sz="4" w:space="4"/>
+          <w:right w:val="single" w:color="D1D5DB" w:sz="4" w:space="4"/>
+        </w:pBdr>
+        <w:shd w:fill="F3F4F6" w:color="auto" w:val="clear"/>
+        <w:spacing w:after="0" w:line="240"/>
+      </w:pPr>
+      <w:r>
+        <w:rPr>
+          <w:rFonts w:ascii="Consolas" w:cs="Consolas" w:eastAsia="Consolas" w:hAnsi="Consolas"/>
+          <w:sz w:val="15"/>
+          <w:szCs w:val="15"/>
+        </w:rPr>
+        <w:t xml:space="preserve">  const dy = (pointer.y - eye.y) / pxPerUnit;</w:t>
+      </w:r>
+    </w:p>
+    <w:p>
+      <w:pPr>
+        <w:keepNext/>
+        <w:keepLines/>
+        <w:pBdr>
+          <w:left w:val="single" w:color="D1D5DB" w:sz="4" w:space="4"/>
+          <w:right w:val="single" w:color="D1D5DB" w:sz="4" w:space="4"/>
+        </w:pBdr>
+        <w:shd w:fill="F3F4F6" w:color="auto" w:val="clear"/>
+        <w:spacing w:after="0" w:line="240"/>
+      </w:pPr>
+      <w:r>
+        <w:rPr>
+          <w:rFonts w:ascii="Consolas" w:cs="Consolas" w:eastAsia="Consolas" w:hAnsi="Consolas"/>
+          <w:sz w:val="15"/>
+          <w:szCs w:val="15"/>
+        </w:rPr>
+        <w:t xml:space="preserve">  const dist = Math.hypot(dx, dy);</w:t>
+      </w:r>
+    </w:p>
+    <w:p>
+      <w:pPr>
+        <w:keepNext/>
+        <w:keepLines/>
+        <w:pBdr>
+          <w:left w:val="single" w:color="D1D5DB" w:sz="4" w:space="4"/>
+          <w:right w:val="single" w:color="D1D5DB" w:sz="4" w:space="4"/>
+        </w:pBdr>
+        <w:shd w:fill="F3F4F6" w:color="auto" w:val="clear"/>
+        <w:spacing w:after="0" w:line="240"/>
+      </w:pPr>
+      <w:r>
+        <w:rPr>
+          <w:rFonts w:ascii="Consolas" w:cs="Consolas" w:eastAsia="Consolas" w:hAnsi="Consolas"/>
+          <w:sz w:val="15"/>
+          <w:szCs w:val="15"/>
+        </w:rPr>
+        <w:t xml:space="preserve">  if (dist &lt; 1e-6) return { x: 0, y: 0 };</w:t>
+      </w:r>
+    </w:p>
+    <w:p>
+      <w:pPr>
+        <w:keepNext/>
+        <w:keepLines/>
+        <w:pBdr>
+          <w:left w:val="single" w:color="D1D5DB" w:sz="4" w:space="4"/>
+          <w:right w:val="single" w:color="D1D5DB" w:sz="4" w:space="4"/>
+        </w:pBdr>
+        <w:shd w:fill="F3F4F6" w:color="auto" w:val="clear"/>
+        <w:spacing w:after="0" w:line="240"/>
+      </w:pPr>
+      <w:r>
+        <w:rPr>
+          <w:rFonts w:ascii="Consolas" w:cs="Consolas" w:eastAsia="Consolas" w:hAnsi="Consolas"/>
+          <w:sz w:val="15"/>
+          <w:szCs w:val="15"/>
+        </w:rPr>
+        <w:t xml:space="preserve">  const max = eyeRadius * ratio;</w:t>
+      </w:r>
+    </w:p>
+    <w:p>
+      <w:pPr>
+        <w:keepNext/>
+        <w:keepLines/>
+        <w:pBdr>
+          <w:left w:val="single" w:color="D1D5DB" w:sz="4" w:space="4"/>
+          <w:right w:val="single" w:color="D1D5DB" w:sz="4" w:space="4"/>
+        </w:pBdr>
+        <w:shd w:fill="F3F4F6" w:color="auto" w:val="clear"/>
+        <w:spacing w:after="0" w:line="240"/>
+      </w:pPr>
+      <w:r>
+        <w:rPr>
+          <w:rFonts w:ascii="Consolas" w:cs="Consolas" w:eastAsia="Consolas" w:hAnsi="Consolas"/>
+          <w:sz w:val="15"/>
+          <w:szCs w:val="15"/>
+        </w:rPr>
+        <w:t xml:space="preserve">  const len = Math.min(max, dist / 6);</w:t>
+      </w:r>
+    </w:p>
+    <w:p>
+      <w:pPr>
+        <w:keepNext/>
+        <w:keepLines/>
+        <w:pBdr>
+          <w:left w:val="single" w:color="D1D5DB" w:sz="4" w:space="4"/>
+          <w:right w:val="single" w:color="D1D5DB" w:sz="4" w:space="4"/>
+        </w:pBdr>
+        <w:shd w:fill="F3F4F6" w:color="auto" w:val="clear"/>
+        <w:spacing w:after="0" w:line="240"/>
+      </w:pPr>
+      <w:r>
+        <w:rPr>
+          <w:rFonts w:ascii="Consolas" w:cs="Consolas" w:eastAsia="Consolas" w:hAnsi="Consolas"/>
+          <w:sz w:val="15"/>
+          <w:szCs w:val="15"/>
+        </w:rPr>
+        <w:t xml:space="preserve">  return { x: (dx / dist) * len, y: (dy / dist) * len };</w:t>
+      </w:r>
+    </w:p>
+    <w:p>
+      <w:pPr>
+        <w:keepNext/>
+        <w:keepLines/>
+        <w:pBdr>
+          <w:left w:val="single" w:color="D1D5DB" w:sz="4" w:space="4"/>
+          <w:right w:val="single" w:color="D1D5DB" w:sz="4" w:space="4"/>
+        </w:pBdr>
+        <w:shd w:fill="F3F4F6" w:color="auto" w:val="clear"/>
+        <w:spacing w:after="0" w:line="240"/>
+      </w:pPr>
+      <w:r>
+        <w:rPr>
+          <w:rFonts w:ascii="Consolas" w:cs="Consolas" w:eastAsia="Consolas" w:hAnsi="Consolas"/>
+          <w:sz w:val="15"/>
+          <w:szCs w:val="15"/>
+        </w:rPr>
+        <w:t xml:space="preserve">}</w:t>
+      </w:r>
+    </w:p>
+    <w:p>
+      <w:pPr>
+        <w:keepNext/>
+        <w:keepLines/>
+        <w:pBdr>
+          <w:left w:val="single" w:color="D1D5DB" w:sz="4" w:space="4"/>
+          <w:right w:val="single" w:color="D1D5DB" w:sz="4" w:space="4"/>
+        </w:pBdr>
+        <w:shd w:fill="F3F4F6" w:color="auto" w:val="clear"/>
+        <w:spacing w:after="0" w:line="240"/>
+      </w:pPr>
+      <w:r>
+        <w:rPr>
+          <w:rFonts w:ascii="Consolas" w:cs="Consolas" w:eastAsia="Consolas" w:hAnsi="Consolas"/>
+          <w:sz w:val="15"/>
+          <w:szCs w:val="15"/>
+        </w:rPr>
+        <w:t xml:space="preserve"> </w:t>
+      </w:r>
+    </w:p>
+    <w:p>
+      <w:pPr>
+        <w:keepNext/>
+        <w:keepLines/>
+        <w:pBdr>
+          <w:left w:val="single" w:color="D1D5DB" w:sz="4" w:space="4"/>
+          <w:right w:val="single" w:color="D1D5DB" w:sz="4" w:space="4"/>
+        </w:pBdr>
+        <w:shd w:fill="F3F4F6" w:color="auto" w:val="clear"/>
+        <w:spacing w:after="0" w:line="240"/>
+      </w:pPr>
+      <w:r>
+        <w:rPr>
+          <w:rFonts w:ascii="Consolas" w:cs="Consolas" w:eastAsia="Consolas" w:hAnsi="Consolas"/>
+          <w:sz w:val="15"/>
+          <w:szCs w:val="15"/>
+        </w:rPr>
+        <w:t xml:space="preserve">export const lerp = (from: number, to: number, t: number) =&gt; from + (to - from) * t;</w:t>
+      </w:r>
+    </w:p>
+    <w:p>
+      <w:pPr>
+        <w:keepNext/>
+        <w:keepLines/>
+        <w:pBdr>
+          <w:left w:val="single" w:color="D1D5DB" w:sz="4" w:space="4"/>
+          <w:right w:val="single" w:color="D1D5DB" w:sz="4" w:space="4"/>
+        </w:pBdr>
+        <w:shd w:fill="F3F4F6" w:color="auto" w:val="clear"/>
+        <w:spacing w:after="0" w:line="240"/>
+      </w:pPr>
+      <w:r>
+        <w:rPr>
+          <w:rFonts w:ascii="Consolas" w:cs="Consolas" w:eastAsia="Consolas" w:hAnsi="Consolas"/>
+          <w:sz w:val="15"/>
+          <w:szCs w:val="15"/>
+        </w:rPr>
+        <w:t xml:space="preserve"> </w:t>
+      </w:r>
+    </w:p>
+    <w:p>
+      <w:pPr>
+        <w:keepNext/>
+        <w:keepLines/>
+        <w:pBdr>
+          <w:left w:val="single" w:color="D1D5DB" w:sz="4" w:space="4"/>
+          <w:right w:val="single" w:color="D1D5DB" w:sz="4" w:space="4"/>
+        </w:pBdr>
+        <w:shd w:fill="F3F4F6" w:color="auto" w:val="clear"/>
+        <w:spacing w:after="0" w:line="240"/>
+      </w:pPr>
+      <w:r>
+        <w:rPr>
+          <w:rFonts w:ascii="Consolas" w:cs="Consolas" w:eastAsia="Consolas" w:hAnsi="Consolas"/>
+          <w:sz w:val="15"/>
+          <w:szCs w:val="15"/>
+        </w:rPr>
+        <w:t xml:space="preserve">// Inside Tagby: one animation frame</w:t>
+      </w:r>
+    </w:p>
+    <w:p>
+      <w:pPr>
+        <w:keepNext/>
+        <w:keepLines/>
+        <w:pBdr>
+          <w:left w:val="single" w:color="D1D5DB" w:sz="4" w:space="4"/>
+          <w:right w:val="single" w:color="D1D5DB" w:sz="4" w:space="4"/>
+        </w:pBdr>
+        <w:shd w:fill="F3F4F6" w:color="auto" w:val="clear"/>
+        <w:spacing w:after="0" w:line="240"/>
+      </w:pPr>
+      <w:r>
+        <w:rPr>
+          <w:rFonts w:ascii="Consolas" w:cs="Consolas" w:eastAsia="Consolas" w:hAnsi="Consolas"/>
+          <w:sz w:val="15"/>
+          <w:szCs w:val="15"/>
+        </w:rPr>
+        <w:t xml:space="preserve">const step = () =&gt; {</w:t>
+      </w:r>
+    </w:p>
+    <w:p>
+      <w:pPr>
+        <w:keepNext/>
+        <w:keepLines/>
+        <w:pBdr>
+          <w:left w:val="single" w:color="D1D5DB" w:sz="4" w:space="4"/>
+          <w:right w:val="single" w:color="D1D5DB" w:sz="4" w:space="4"/>
+        </w:pBdr>
+        <w:shd w:fill="F3F4F6" w:color="auto" w:val="clear"/>
+        <w:spacing w:after="0" w:line="240"/>
+      </w:pPr>
+      <w:r>
+        <w:rPr>
+          <w:rFonts w:ascii="Consolas" w:cs="Consolas" w:eastAsia="Consolas" w:hAnsi="Consolas"/>
+          <w:sz w:val="15"/>
+          <w:szCs w:val="15"/>
+        </w:rPr>
+        <w:t xml:space="preserve">  if (pointer) targets = centers.map((c) =&gt; pupilTarget(c, pointer!, pxPerUnit, EYE_RX));</w:t>
+      </w:r>
+    </w:p>
+    <w:p>
+      <w:pPr>
+        <w:keepNext/>
+        <w:keepLines/>
+        <w:pBdr>
+          <w:left w:val="single" w:color="D1D5DB" w:sz="4" w:space="4"/>
+          <w:right w:val="single" w:color="D1D5DB" w:sz="4" w:space="4"/>
+        </w:pBdr>
+        <w:shd w:fill="F3F4F6" w:color="auto" w:val="clear"/>
+        <w:spacing w:after="0" w:line="240"/>
+      </w:pPr>
+      <w:r>
+        <w:rPr>
+          <w:rFonts w:ascii="Consolas" w:cs="Consolas" w:eastAsia="Consolas" w:hAnsi="Consolas"/>
+          <w:sz w:val="15"/>
+          <w:szCs w:val="15"/>
+        </w:rPr>
+        <w:t xml:space="preserve">  let moving = false;</w:t>
+      </w:r>
+    </w:p>
+    <w:p>
+      <w:pPr>
+        <w:keepNext/>
+        <w:keepLines/>
+        <w:pBdr>
+          <w:left w:val="single" w:color="D1D5DB" w:sz="4" w:space="4"/>
+          <w:right w:val="single" w:color="D1D5DB" w:sz="4" w:space="4"/>
+        </w:pBdr>
+        <w:shd w:fill="F3F4F6" w:color="auto" w:val="clear"/>
+        <w:spacing w:after="0" w:line="240"/>
+      </w:pPr>
+      <w:r>
+        <w:rPr>
+          <w:rFonts w:ascii="Consolas" w:cs="Consolas" w:eastAsia="Consolas" w:hAnsi="Consolas"/>
+          <w:sz w:val="15"/>
+          <w:szCs w:val="15"/>
+        </w:rPr>
+        <w:t xml:space="preserve">  current.forEach((c, i) =&gt; {</w:t>
+      </w:r>
+    </w:p>
+    <w:p>
+      <w:pPr>
+        <w:keepNext/>
+        <w:keepLines/>
+        <w:pBdr>
+          <w:left w:val="single" w:color="D1D5DB" w:sz="4" w:space="4"/>
+          <w:right w:val="single" w:color="D1D5DB" w:sz="4" w:space="4"/>
+        </w:pBdr>
+        <w:shd w:fill="F3F4F6" w:color="auto" w:val="clear"/>
+        <w:spacing w:after="0" w:line="240"/>
+      </w:pPr>
+      <w:r>
+        <w:rPr>
+          <w:rFonts w:ascii="Consolas" w:cs="Consolas" w:eastAsia="Consolas" w:hAnsi="Consolas"/>
+          <w:sz w:val="15"/>
+          <w:szCs w:val="15"/>
+        </w:rPr>
+        <w:t xml:space="preserve">    const t = targets[i];</w:t>
+      </w:r>
+    </w:p>
+    <w:p>
+      <w:pPr>
+        <w:keepNext/>
+        <w:keepLines/>
+        <w:pBdr>
+          <w:left w:val="single" w:color="D1D5DB" w:sz="4" w:space="4"/>
+          <w:right w:val="single" w:color="D1D5DB" w:sz="4" w:space="4"/>
+        </w:pBdr>
+        <w:shd w:fill="F3F4F6" w:color="auto" w:val="clear"/>
+        <w:spacing w:after="0" w:line="240"/>
+      </w:pPr>
+      <w:r>
+        <w:rPr>
+          <w:rFonts w:ascii="Consolas" w:cs="Consolas" w:eastAsia="Consolas" w:hAnsi="Consolas"/>
+          <w:sz w:val="15"/>
+          <w:szCs w:val="15"/>
+        </w:rPr>
+        <w:t xml:space="preserve">    c.x = reduceMotion ? t.x : lerp(c.x, t.x, ease);</w:t>
+      </w:r>
+    </w:p>
+    <w:p>
+      <w:pPr>
+        <w:keepNext/>
+        <w:keepLines/>
+        <w:pBdr>
+          <w:left w:val="single" w:color="D1D5DB" w:sz="4" w:space="4"/>
+          <w:right w:val="single" w:color="D1D5DB" w:sz="4" w:space="4"/>
+        </w:pBdr>
+        <w:shd w:fill="F3F4F6" w:color="auto" w:val="clear"/>
+        <w:spacing w:after="0" w:line="240"/>
+      </w:pPr>
+      <w:r>
+        <w:rPr>
+          <w:rFonts w:ascii="Consolas" w:cs="Consolas" w:eastAsia="Consolas" w:hAnsi="Consolas"/>
+          <w:sz w:val="15"/>
+          <w:szCs w:val="15"/>
+        </w:rPr>
+        <w:t xml:space="preserve">    c.y = reduceMotion ? t.y : lerp(c.y, t.y, ease);</w:t>
+      </w:r>
+    </w:p>
+    <w:p>
+      <w:pPr>
+        <w:keepNext/>
+        <w:keepLines/>
+        <w:pBdr>
+          <w:left w:val="single" w:color="D1D5DB" w:sz="4" w:space="4"/>
+          <w:right w:val="single" w:color="D1D5DB" w:sz="4" w:space="4"/>
+        </w:pBdr>
+        <w:shd w:fill="F3F4F6" w:color="auto" w:val="clear"/>
+        <w:spacing w:after="0" w:line="240"/>
+      </w:pPr>
+      <w:r>
+        <w:rPr>
+          <w:rFonts w:ascii="Consolas" w:cs="Consolas" w:eastAsia="Consolas" w:hAnsi="Consolas"/>
+          <w:sz w:val="15"/>
+          <w:szCs w:val="15"/>
+        </w:rPr>
+        <w:t xml:space="preserve">    if (Math.abs(c.x - t.x) &gt; 0.01 || Math.abs(c.y - t.y) &gt; 0.01) moving = true;</w:t>
+      </w:r>
+    </w:p>
+    <w:p>
+      <w:pPr>
+        <w:keepNext/>
+        <w:keepLines/>
+        <w:pBdr>
+          <w:left w:val="single" w:color="D1D5DB" w:sz="4" w:space="4"/>
+          <w:right w:val="single" w:color="D1D5DB" w:sz="4" w:space="4"/>
+        </w:pBdr>
+        <w:shd w:fill="F3F4F6" w:color="auto" w:val="clear"/>
+        <w:spacing w:after="0" w:line="240"/>
+      </w:pPr>
+      <w:r>
+        <w:rPr>
+          <w:rFonts w:ascii="Consolas" w:cs="Consolas" w:eastAsia="Consolas" w:hAnsi="Consolas"/>
+          <w:sz w:val="15"/>
+          <w:szCs w:val="15"/>
+        </w:rPr>
+        <w:t xml:space="preserve">    pupilRefs.current[i]?.setAttribute("transform", `translate(${c.x.toFixed(2)} ${c.y.toFixed(2)})`);</w:t>
+      </w:r>
+    </w:p>
+    <w:p>
+      <w:pPr>
+        <w:keepNext/>
+        <w:keepLines/>
+        <w:pBdr>
+          <w:left w:val="single" w:color="D1D5DB" w:sz="4" w:space="4"/>
+          <w:right w:val="single" w:color="D1D5DB" w:sz="4" w:space="4"/>
+        </w:pBdr>
+        <w:shd w:fill="F3F4F6" w:color="auto" w:val="clear"/>
+        <w:spacing w:after="0" w:line="240"/>
+      </w:pPr>
+      <w:r>
+        <w:rPr>
+          <w:rFonts w:ascii="Consolas" w:cs="Consolas" w:eastAsia="Consolas" w:hAnsi="Consolas"/>
+          <w:sz w:val="15"/>
+          <w:szCs w:val="15"/>
+        </w:rPr>
+        <w:t xml:space="preserve">  });</w:t>
+      </w:r>
+    </w:p>
+    <w:p>
+      <w:pPr>
+        <w:keepNext/>
+        <w:keepLines/>
+        <w:pBdr>
+          <w:left w:val="single" w:color="D1D5DB" w:sz="4" w:space="4"/>
+          <w:right w:val="single" w:color="D1D5DB" w:sz="4" w:space="4"/>
+        </w:pBdr>
+        <w:shd w:fill="F3F4F6" w:color="auto" w:val="clear"/>
+        <w:spacing w:after="0" w:line="240"/>
+      </w:pPr>
+      <w:r>
+        <w:rPr>
+          <w:rFonts w:ascii="Consolas" w:cs="Consolas" w:eastAsia="Consolas" w:hAnsi="Consolas"/>
+          <w:sz w:val="15"/>
+          <w:szCs w:val="15"/>
+        </w:rPr>
+        <w:t xml:space="preserve">  // Stop the loop as soon as the pupils have arrived: no constantly running animation.</w:t>
+      </w:r>
+    </w:p>
+    <w:p>
+      <w:pPr>
+        <w:keepNext/>
+        <w:keepLines/>
+        <w:pBdr>
+          <w:left w:val="single" w:color="D1D5DB" w:sz="4" w:space="4"/>
+          <w:right w:val="single" w:color="D1D5DB" w:sz="4" w:space="4"/>
+        </w:pBdr>
+        <w:shd w:fill="F3F4F6" w:color="auto" w:val="clear"/>
+        <w:spacing w:after="0" w:line="240"/>
+      </w:pPr>
+      <w:r>
+        <w:rPr>
+          <w:rFonts w:ascii="Consolas" w:cs="Consolas" w:eastAsia="Consolas" w:hAnsi="Consolas"/>
+          <w:sz w:val="15"/>
+          <w:szCs w:val="15"/>
+        </w:rPr>
+        <w:t xml:space="preserve">  raf = moving ? requestAnimationFrame(step) : 0;</w:t>
+      </w:r>
+    </w:p>
+    <w:p>
+      <w:pPr>
+        <w:keepNext w:val="false"/>
+        <w:keepLines/>
+        <w:pBdr>
+          <w:left w:val="single" w:color="D1D5DB" w:sz="4" w:space="4"/>
+          <w:bottom w:val="single" w:color="D1D5DB" w:sz="4" w:space="4"/>
+          <w:right w:val="single" w:color="D1D5DB" w:sz="4" w:space="4"/>
+        </w:pBdr>
+        <w:shd w:fill="F3F4F6" w:color="auto" w:val="clear"/>
+        <w:spacing w:after="0" w:line="240"/>
+      </w:pPr>
+      <w:r>
+        <w:rPr>
+          <w:rFonts w:ascii="Consolas" w:cs="Consolas" w:eastAsia="Consolas" w:hAnsi="Consolas"/>
+          <w:sz w:val="15"/>
+          <w:szCs w:val="15"/>
+        </w:rPr>
+        <w:t xml:space="preserve">};</w:t>
+      </w:r>
+    </w:p>
+    <w:p>
+      <w:pPr>
+        <w:keepNext/>
+        <w:spacing w:after="60" w:before="160"/>
+      </w:pPr>
+      <w:r>
+        <w:rPr>
+          <w:rFonts w:ascii="Segoe UI" w:cs="Segoe UI" w:eastAsia="Segoe UI" w:hAnsi="Segoe UI"/>
+          <w:b/>
+          <w:bCs/>
+          <w:sz w:val="21"/>
+          <w:szCs w:val="21"/>
+        </w:rPr>
+        <w:t xml:space="preserve">Explanation:</w:t>
+      </w:r>
+    </w:p>
+    <w:p>
+      <w:pPr>
+        <w:spacing w:after="160" w:line="276"/>
+      </w:pPr>
+      <w:r>
+        <w:rPr>
+          <w:rFonts w:ascii="Segoe UI" w:cs="Segoe UI" w:eastAsia="Segoe UI" w:hAnsi="Segoe UI"/>
+          <w:sz w:val="21"/>
+          <w:szCs w:val="21"/>
+        </w:rPr>
+        <w:t xml:space="preserve">Tagby's eyes follow the pointer in three steps. First, pupilTarget() takes the vector from the eye's centre on screen to the pointer and divides it by the number of screen pixels per SVG unit, so the result is correct whether Tagby is drawn 150 pixels tall or half the height of the window. Second, the length of that vector is clamped to 35 % of the eye radius, so the pupil always stays inside the eye, and it shrinks smoothly when the pointer is close to the face. Third, on every animation frame each pupil moves 15 % of the remaining distance toward its target (linear interpolation, lerp), which produces a soft, eased motion. The requestAnimationFrame loop stops as soon as both pupils have arrived, so no animation runs while nothing is moving. Under prefers-reduced-motion the pupils jump straight to the target instead of easing.</w:t>
+      </w:r>
+    </w:p>
+    <w:p>
+      <w:pPr>
         <w:pBdr>
           <w:bottom w:val="single" w:color="BFBFBF" w:sz="6" w:space="8"/>
         </w:pBdr>
@@ -3885,6 +4576,7 @@
     </w:p>
     <w:p>
       <w:pPr>
+        <w:keepNext/>
         <w:spacing w:after="160" w:line="276"/>
       </w:pPr>
       <w:r>
@@ -3909,11 +4601,12 @@
           <w:sz w:val="21"/>
           <w:szCs w:val="21"/>
         </w:rPr>
-        <w:t xml:space="preserve">Figure 1: Main Output: Owner dashboard listing tags with status badges, scan counts and unread messages</w:t>
-      </w:r>
-    </w:p>
-    <w:p>
-      <w:pPr>
+        <w:t xml:space="preserve">Figure 1: Main Output: Landing page with the Tagby mascot (pointer at the top-left; the eyes follow it)</w:t>
+      </w:r>
+    </w:p>
+    <w:p>
+      <w:pPr>
+        <w:keepNext w:val="false"/>
         <w:spacing w:after="240"/>
         <w:jc w:val="center"/>
       </w:pPr>
@@ -3922,7 +4615,7 @@
           <wp:inline distT="0" distB="0" distL="0" distR="0">
             <wp:extent cx="5334000" cy="3333750"/>
             <wp:effectExtent t="0" r="0" b="0" l="0"/>
-            <wp:docPr id="1" name="dashboard.png" descr="dashboard.png" title="dashboard.png"/>
+            <wp:docPr id="1" name="landing-desktop.png" descr="landing-desktop.png" title="landing-desktop.png"/>
             <wp:cNvGraphicFramePr>
               <a:graphicFrameLocks xmlns:a="http://schemas.openxmlformats.org/drawingml/2006/main" noChangeAspect="1"/>
             </wp:cNvGraphicFramePr>
@@ -3971,11 +4664,12 @@
           <w:sz w:val="21"/>
           <w:szCs w:val="21"/>
         </w:rPr>
-        <w:t xml:space="preserve">Figure 2: Tag maker with live real-scale preview (school-bag label template)</w:t>
-      </w:r>
-    </w:p>
-    <w:p>
-      <w:pPr>
+        <w:t xml:space="preserve">Figure 2: Owner dashboard listing tags with status badges, scan counts and unread messages</w:t>
+      </w:r>
+    </w:p>
+    <w:p>
+      <w:pPr>
+        <w:keepNext w:val="false"/>
         <w:spacing w:after="240"/>
         <w:jc w:val="center"/>
       </w:pPr>
@@ -3984,7 +4678,7 @@
           <wp:inline distT="0" distB="0" distL="0" distR="0">
             <wp:extent cx="5334000" cy="3333750"/>
             <wp:effectExtent t="0" r="0" b="0" l="0"/>
-            <wp:docPr id="2" name="tag-maker.png" descr="tag-maker.png" title="tag-maker.png"/>
+            <wp:docPr id="2" name="dashboard.png" descr="dashboard.png" title="dashboard.png"/>
             <wp:cNvGraphicFramePr>
               <a:graphicFrameLocks xmlns:a="http://schemas.openxmlformats.org/drawingml/2006/main" noChangeAspect="1"/>
             </wp:cNvGraphicFramePr>
@@ -4033,20 +4727,21 @@
           <w:sz w:val="21"/>
           <w:szCs w:val="21"/>
         </w:rPr>
-        <w:t xml:space="preserve">Figure 3: Exported PNG of a luggage tag (3× resolution) with the embedded QR code</w:t>
-      </w:r>
-    </w:p>
-    <w:p>
-      <w:pPr>
+        <w:t xml:space="preserve">Figure 3: Tag maker with live real-scale preview (school-bag label template)</w:t>
+      </w:r>
+    </w:p>
+    <w:p>
+      <w:pPr>
+        <w:keepNext w:val="false"/>
         <w:spacing w:after="240"/>
         <w:jc w:val="center"/>
       </w:pPr>
       <w:r>
         <w:drawing>
           <wp:inline distT="0" distB="0" distL="0" distR="0">
-            <wp:extent cx="4000500" cy="2200275"/>
+            <wp:extent cx="5334000" cy="3333750"/>
             <wp:effectExtent t="0" r="0" b="0" l="0"/>
-            <wp:docPr id="3" name="tag-export.png" descr="tag-export.png" title="tag-export.png"/>
+            <wp:docPr id="3" name="tag-maker.png" descr="tag-maker.png" title="tag-maker.png"/>
             <wp:cNvGraphicFramePr>
               <a:graphicFrameLocks xmlns:a="http://schemas.openxmlformats.org/drawingml/2006/main" noChangeAspect="1"/>
             </wp:cNvGraphicFramePr>
@@ -4069,7 +4764,7 @@
                   <pic:spPr bwMode="auto">
                     <a:xfrm>
                       <a:off x="0" y="0"/>
-                      <a:ext cx="4000500" cy="2200275"/>
+                      <a:ext cx="5334000" cy="3333750"/>
                     </a:xfrm>
                     <a:prstGeom prst="rect">
                       <a:avLst/>
@@ -4095,20 +4790,21 @@
           <w:sz w:val="21"/>
           <w:szCs w:val="21"/>
         </w:rPr>
-        <w:t xml:space="preserve">Figure 4: Tag management page: export options, status controls and anonymous conversation with a finder</w:t>
-      </w:r>
-    </w:p>
-    <w:p>
-      <w:pPr>
+        <w:t xml:space="preserve">Figure 4: Exported PNG of a luggage tag (3× resolution) with the embedded QR code</w:t>
+      </w:r>
+    </w:p>
+    <w:p>
+      <w:pPr>
+        <w:keepNext w:val="false"/>
         <w:spacing w:after="240"/>
         <w:jc w:val="center"/>
       </w:pPr>
       <w:r>
         <w:drawing>
           <wp:inline distT="0" distB="0" distL="0" distR="0">
-            <wp:extent cx="5334000" cy="3333750"/>
+            <wp:extent cx="4000500" cy="2200275"/>
             <wp:effectExtent t="0" r="0" b="0" l="0"/>
-            <wp:docPr id="4" name="owner-chat.png" descr="owner-chat.png" title="owner-chat.png"/>
+            <wp:docPr id="4" name="tag-export.png" descr="tag-export.png" title="tag-export.png"/>
             <wp:cNvGraphicFramePr>
               <a:graphicFrameLocks xmlns:a="http://schemas.openxmlformats.org/drawingml/2006/main" noChangeAspect="1"/>
             </wp:cNvGraphicFramePr>
@@ -4131,7 +4827,7 @@
                   <pic:spPr bwMode="auto">
                     <a:xfrm>
                       <a:off x="0" y="0"/>
-                      <a:ext cx="5334000" cy="3333750"/>
+                      <a:ext cx="4000500" cy="2200275"/>
                     </a:xfrm>
                     <a:prstGeom prst="rect">
                       <a:avLst/>
@@ -4157,11 +4853,12 @@
           <w:sz w:val="21"/>
           <w:szCs w:val="21"/>
         </w:rPr>
-        <w:t xml:space="preserve">Figure 5: Public finder page shown after scanning a tag</w:t>
-      </w:r>
-    </w:p>
-    <w:p>
-      <w:pPr>
+        <w:t xml:space="preserve">Figure 5: Tag management page: export options, status controls and anonymous conversation with a finder</w:t>
+      </w:r>
+    </w:p>
+    <w:p>
+      <w:pPr>
+        <w:keepNext w:val="false"/>
         <w:spacing w:after="240"/>
         <w:jc w:val="center"/>
       </w:pPr>
@@ -4170,7 +4867,7 @@
           <wp:inline distT="0" distB="0" distL="0" distR="0">
             <wp:extent cx="5334000" cy="3333750"/>
             <wp:effectExtent t="0" r="0" b="0" l="0"/>
-            <wp:docPr id="5" name="finder-page.png" descr="finder-page.png" title="finder-page.png"/>
+            <wp:docPr id="5" name="owner-chat.png" descr="owner-chat.png" title="owner-chat.png"/>
             <wp:cNvGraphicFramePr>
               <a:graphicFrameLocks xmlns:a="http://schemas.openxmlformats.org/drawingml/2006/main" noChangeAspect="1"/>
             </wp:cNvGraphicFramePr>
@@ -4219,11 +4916,12 @@
           <w:sz w:val="21"/>
           <w:szCs w:val="21"/>
         </w:rPr>
-        <w:t xml:space="preserve">Figure 6: Finder page for an item reported as Lost, with the alert banner</w:t>
-      </w:r>
-    </w:p>
-    <w:p>
-      <w:pPr>
+        <w:t xml:space="preserve">Figure 6: Public finder page shown after scanning a tag</w:t>
+      </w:r>
+    </w:p>
+    <w:p>
+      <w:pPr>
+        <w:keepNext w:val="false"/>
         <w:spacing w:after="240"/>
         <w:jc w:val="center"/>
       </w:pPr>
@@ -4232,7 +4930,7 @@
           <wp:inline distT="0" distB="0" distL="0" distR="0">
             <wp:extent cx="5334000" cy="3333750"/>
             <wp:effectExtent t="0" r="0" b="0" l="0"/>
-            <wp:docPr id="6" name="finder-lost.png" descr="finder-lost.png" title="finder-lost.png"/>
+            <wp:docPr id="6" name="finder-page.png" descr="finder-page.png" title="finder-page.png"/>
             <wp:cNvGraphicFramePr>
               <a:graphicFrameLocks xmlns:a="http://schemas.openxmlformats.org/drawingml/2006/main" noChangeAspect="1"/>
             </wp:cNvGraphicFramePr>
@@ -4281,20 +4979,21 @@
           <w:sz w:val="21"/>
           <w:szCs w:val="21"/>
         </w:rPr>
-        <w:t xml:space="preserve">Figure 7: Finder page on a mobile phone (390 × 844)</w:t>
-      </w:r>
-    </w:p>
-    <w:p>
-      <w:pPr>
+        <w:t xml:space="preserve">Figure 7: Finder page for an item reported as Lost, with the alert banner</w:t>
+      </w:r>
+    </w:p>
+    <w:p>
+      <w:pPr>
+        <w:keepNext w:val="false"/>
         <w:spacing w:after="240"/>
         <w:jc w:val="center"/>
       </w:pPr>
       <w:r>
         <w:drawing>
           <wp:inline distT="0" distB="0" distL="0" distR="0">
-            <wp:extent cx="2028825" cy="4381500"/>
+            <wp:extent cx="5334000" cy="3333750"/>
             <wp:effectExtent t="0" r="0" b="0" l="0"/>
-            <wp:docPr id="7" name="finder-mobile.png" descr="finder-mobile.png" title="finder-mobile.png"/>
+            <wp:docPr id="7" name="finder-lost.png" descr="finder-lost.png" title="finder-lost.png"/>
             <wp:cNvGraphicFramePr>
               <a:graphicFrameLocks xmlns:a="http://schemas.openxmlformats.org/drawingml/2006/main" noChangeAspect="1"/>
             </wp:cNvGraphicFramePr>
@@ -4317,7 +5016,7 @@
                   <pic:spPr bwMode="auto">
                     <a:xfrm>
                       <a:off x="0" y="0"/>
-                      <a:ext cx="2028825" cy="4381500"/>
+                      <a:ext cx="5334000" cy="3333750"/>
                     </a:xfrm>
                     <a:prstGeom prst="rect">
                       <a:avLst/>
@@ -4343,20 +5042,21 @@
           <w:sz w:val="21"/>
           <w:szCs w:val="21"/>
         </w:rPr>
-        <w:t xml:space="preserve">Figure 8: A4 print sheet with several tags at real size</w:t>
-      </w:r>
-    </w:p>
-    <w:p>
-      <w:pPr>
+        <w:t xml:space="preserve">Figure 8: Finder page on a mobile phone (390 × 844)</w:t>
+      </w:r>
+    </w:p>
+    <w:p>
+      <w:pPr>
+        <w:keepNext w:val="false"/>
         <w:spacing w:after="240"/>
         <w:jc w:val="center"/>
       </w:pPr>
       <w:r>
         <w:drawing>
           <wp:inline distT="0" distB="0" distL="0" distR="0">
-            <wp:extent cx="5334000" cy="3333750"/>
+            <wp:extent cx="2028825" cy="4381500"/>
             <wp:effectExtent t="0" r="0" b="0" l="0"/>
-            <wp:docPr id="8" name="print-sheet.png" descr="print-sheet.png" title="print-sheet.png"/>
+            <wp:docPr id="8" name="finder-mobile.png" descr="finder-mobile.png" title="finder-mobile.png"/>
             <wp:cNvGraphicFramePr>
               <a:graphicFrameLocks xmlns:a="http://schemas.openxmlformats.org/drawingml/2006/main" noChangeAspect="1"/>
             </wp:cNvGraphicFramePr>
@@ -4379,7 +5079,7 @@
                   <pic:spPr bwMode="auto">
                     <a:xfrm>
                       <a:off x="0" y="0"/>
-                      <a:ext cx="5334000" cy="3333750"/>
+                      <a:ext cx="2028825" cy="4381500"/>
                     </a:xfrm>
                     <a:prstGeom prst="rect">
                       <a:avLst/>
@@ -4405,20 +5105,21 @@
           <w:sz w:val="21"/>
           <w:szCs w:val="21"/>
         </w:rPr>
-        <w:t xml:space="preserve">Figure 9: Landing page</w:t>
-      </w:r>
-    </w:p>
-    <w:p>
-      <w:pPr>
+        <w:t xml:space="preserve">Figure 9: Tagby's moods on the finder page: worried for a Lost item (top) and celebrating for a Found item (bottom)</w:t>
+      </w:r>
+    </w:p>
+    <w:p>
+      <w:pPr>
+        <w:keepNext/>
         <w:spacing w:after="240"/>
         <w:jc w:val="center"/>
       </w:pPr>
       <w:r>
         <w:drawing>
           <wp:inline distT="0" distB="0" distL="0" distR="0">
-            <wp:extent cx="5334000" cy="3333750"/>
+            <wp:extent cx="4191000" cy="2619375"/>
             <wp:effectExtent t="0" r="0" b="0" l="0"/>
-            <wp:docPr id="9" name="landing.png" descr="landing.png" title="landing.png"/>
+            <wp:docPr id="9" name="finder-lost-tagby.png" descr="finder-lost-tagby.png" title="finder-lost-tagby.png"/>
             <wp:cNvGraphicFramePr>
               <a:graphicFrameLocks xmlns:a="http://schemas.openxmlformats.org/drawingml/2006/main" noChangeAspect="1"/>
             </wp:cNvGraphicFramePr>
@@ -4441,7 +5142,7 @@
                   <pic:spPr bwMode="auto">
                     <a:xfrm>
                       <a:off x="0" y="0"/>
-                      <a:ext cx="5334000" cy="3333750"/>
+                      <a:ext cx="4191000" cy="2619375"/>
                     </a:xfrm>
                     <a:prstGeom prst="rect">
                       <a:avLst/>
@@ -4456,31 +5157,16 @@
     </w:p>
     <w:p>
       <w:pPr>
-        <w:keepNext/>
-        <w:spacing w:after="80" w:before="120"/>
-      </w:pPr>
-      <w:r>
-        <w:rPr>
-          <w:rFonts w:ascii="Segoe UI" w:cs="Segoe UI" w:eastAsia="Segoe UI" w:hAnsi="Segoe UI"/>
-          <w:b/>
-          <w:bCs/>
-          <w:sz w:val="21"/>
-          <w:szCs w:val="21"/>
-        </w:rPr>
-        <w:t xml:space="preserve">Figure 10: Login page</w:t>
-      </w:r>
-    </w:p>
-    <w:p>
-      <w:pPr>
+        <w:keepNext w:val="false"/>
         <w:spacing w:after="240"/>
         <w:jc w:val="center"/>
       </w:pPr>
       <w:r>
         <w:drawing>
           <wp:inline distT="0" distB="0" distL="0" distR="0">
-            <wp:extent cx="5334000" cy="3333750"/>
+            <wp:extent cx="4191000" cy="2619375"/>
             <wp:effectExtent t="0" r="0" b="0" l="0"/>
-            <wp:docPr id="10" name="login.png" descr="login.png" title="login.png"/>
+            <wp:docPr id="10" name="finder-found-tagby.png" descr="finder-found-tagby.png" title="finder-found-tagby.png"/>
             <wp:cNvGraphicFramePr>
               <a:graphicFrameLocks xmlns:a="http://schemas.openxmlformats.org/drawingml/2006/main" noChangeAspect="1"/>
             </wp:cNvGraphicFramePr>
@@ -4503,7 +5189,7 @@
                   <pic:spPr bwMode="auto">
                     <a:xfrm>
                       <a:off x="0" y="0"/>
-                      <a:ext cx="5334000" cy="3333750"/>
+                      <a:ext cx="4191000" cy="2619375"/>
                     </a:xfrm>
                     <a:prstGeom prst="rect">
                       <a:avLst/>
@@ -4518,86 +5204,32 @@
     </w:p>
     <w:p>
       <w:pPr>
-        <w:pBdr>
-          <w:bottom w:val="single" w:color="BFBFBF" w:sz="6" w:space="8"/>
-        </w:pBdr>
-        <w:spacing w:after="120" w:before="120"/>
-      </w:pPr>
-    </w:p>
-    <w:p>
-      <w:pPr>
-        <w:keepNext/>
-        <w:spacing w:after="200" w:before="360"/>
+        <w:keepNext/>
+        <w:spacing w:after="80" w:before="120"/>
       </w:pPr>
       <w:r>
         <w:rPr>
           <w:rFonts w:ascii="Segoe UI" w:cs="Segoe UI" w:eastAsia="Segoe UI" w:hAnsi="Segoe UI"/>
           <w:b/>
           <w:bCs/>
-          <w:sz w:val="30"/>
-          <w:szCs w:val="30"/>
-        </w:rPr>
-        <w:t xml:space="preserve">8. GITHUB REPOSITORY SCREENSHOT AND LINK</w:t>
-      </w:r>
-    </w:p>
-    <w:p>
-      <w:pPr>
-        <w:spacing w:after="120"/>
-      </w:pPr>
-      <w:r>
-        <w:rPr>
-          <w:rFonts w:ascii="Segoe UI" w:cs="Segoe UI" w:eastAsia="Segoe UI" w:hAnsi="Segoe UI"/>
-          <w:b/>
-          <w:bCs/>
-          <w:sz w:val="21"/>
-          <w:szCs w:val="21"/>
-        </w:rPr>
-        <w:t xml:space="preserve">GitHub Repository Link:</w:t>
-      </w:r>
-      <w:r>
-        <w:rPr>
-          <w:rFonts w:ascii="Segoe UI" w:cs="Segoe UI" w:eastAsia="Segoe UI" w:hAnsi="Segoe UI"/>
-          <w:sz w:val="21"/>
-          <w:szCs w:val="21"/>
-        </w:rPr>
-        <w:t xml:space="preserve"> https://github.com/Jahnavi1110/bagtag</w:t>
-      </w:r>
-    </w:p>
-    <w:p>
-      <w:pPr>
-        <w:pBdr>
-          <w:bottom w:val="single" w:color="BFBFBF" w:sz="6" w:space="8"/>
-        </w:pBdr>
-        <w:spacing w:after="120" w:before="120"/>
-      </w:pPr>
-    </w:p>
-    <w:p>
-      <w:pPr>
-        <w:keepNext/>
-        <w:spacing w:after="80" w:before="120"/>
-      </w:pPr>
-      <w:r>
-        <w:rPr>
-          <w:rFonts w:ascii="Segoe UI" w:cs="Segoe UI" w:eastAsia="Segoe UI" w:hAnsi="Segoe UI"/>
-          <w:b/>
-          <w:bCs/>
-          <w:sz w:val="21"/>
-          <w:szCs w:val="21"/>
-        </w:rPr>
-        <w:t xml:space="preserve">Repository Screenshot:</w:t>
-      </w:r>
-    </w:p>
-    <w:p>
-      <w:pPr>
+          <w:sz w:val="21"/>
+          <w:szCs w:val="21"/>
+        </w:rPr>
+        <w:t xml:space="preserve">Figure 10: A4 print sheet with several tags at real size</w:t>
+      </w:r>
+    </w:p>
+    <w:p>
+      <w:pPr>
+        <w:keepNext w:val="false"/>
         <w:spacing w:after="240"/>
         <w:jc w:val="center"/>
       </w:pPr>
       <w:r>
         <w:drawing>
           <wp:inline distT="0" distB="0" distL="0" distR="0">
-            <wp:extent cx="4762500" cy="2981325"/>
+            <wp:extent cx="5334000" cy="3333750"/>
             <wp:effectExtent t="0" r="0" b="0" l="0"/>
-            <wp:docPr id="11" name="github-repo.png" descr="github-repo.png" title="github-repo.png"/>
+            <wp:docPr id="11" name="print-sheet.png" descr="print-sheet.png" title="print-sheet.png"/>
             <wp:cNvGraphicFramePr>
               <a:graphicFrameLocks xmlns:a="http://schemas.openxmlformats.org/drawingml/2006/main" noChangeAspect="1"/>
             </wp:cNvGraphicFramePr>
@@ -4620,6 +5252,187 @@
                   <pic:spPr bwMode="auto">
                     <a:xfrm>
                       <a:off x="0" y="0"/>
+                      <a:ext cx="5334000" cy="3333750"/>
+                    </a:xfrm>
+                    <a:prstGeom prst="rect">
+                      <a:avLst/>
+                    </a:prstGeom>
+                  </pic:spPr>
+                </pic:pic>
+              </a:graphicData>
+            </a:graphic>
+          </wp:inline>
+        </w:drawing>
+      </w:r>
+    </w:p>
+    <w:p>
+      <w:pPr>
+        <w:keepNext/>
+        <w:spacing w:after="80" w:before="120"/>
+      </w:pPr>
+      <w:r>
+        <w:rPr>
+          <w:rFonts w:ascii="Segoe UI" w:cs="Segoe UI" w:eastAsia="Segoe UI" w:hAnsi="Segoe UI"/>
+          <w:b/>
+          <w:bCs/>
+          <w:sz w:val="21"/>
+          <w:szCs w:val="21"/>
+        </w:rPr>
+        <w:t xml:space="preserve">Figure 11: Login page</w:t>
+      </w:r>
+    </w:p>
+    <w:p>
+      <w:pPr>
+        <w:keepNext w:val="false"/>
+        <w:spacing w:after="240"/>
+        <w:jc w:val="center"/>
+      </w:pPr>
+      <w:r>
+        <w:drawing>
+          <wp:inline distT="0" distB="0" distL="0" distR="0">
+            <wp:extent cx="5334000" cy="3333750"/>
+            <wp:effectExtent t="0" r="0" b="0" l="0"/>
+            <wp:docPr id="12" name="login.png" descr="login.png" title="login.png"/>
+            <wp:cNvGraphicFramePr>
+              <a:graphicFrameLocks xmlns:a="http://schemas.openxmlformats.org/drawingml/2006/main" noChangeAspect="1"/>
+            </wp:cNvGraphicFramePr>
+            <a:graphic xmlns:a="http://schemas.openxmlformats.org/drawingml/2006/main">
+              <a:graphicData uri="http://schemas.openxmlformats.org/drawingml/2006/picture">
+                <pic:pic xmlns:pic="http://schemas.openxmlformats.org/drawingml/2006/picture">
+                  <pic:nvPicPr>
+                    <pic:cNvPr id="0" name="" descr=""/>
+                    <pic:cNvPicPr>
+                      <a:picLocks noChangeAspect="1" noChangeArrowheads="1"/>
+                    </pic:cNvPicPr>
+                  </pic:nvPicPr>
+                  <pic:blipFill>
+                    <a:blip r:embed="rId19" cstate="none"/>
+                    <a:srcRect/>
+                    <a:stretch>
+                      <a:fillRect/>
+                    </a:stretch>
+                  </pic:blipFill>
+                  <pic:spPr bwMode="auto">
+                    <a:xfrm>
+                      <a:off x="0" y="0"/>
+                      <a:ext cx="5334000" cy="3333750"/>
+                    </a:xfrm>
+                    <a:prstGeom prst="rect">
+                      <a:avLst/>
+                    </a:prstGeom>
+                  </pic:spPr>
+                </pic:pic>
+              </a:graphicData>
+            </a:graphic>
+          </wp:inline>
+        </w:drawing>
+      </w:r>
+    </w:p>
+    <w:p>
+      <w:pPr>
+        <w:pBdr>
+          <w:bottom w:val="single" w:color="BFBFBF" w:sz="6" w:space="8"/>
+        </w:pBdr>
+        <w:spacing w:after="120" w:before="120"/>
+      </w:pPr>
+    </w:p>
+    <w:p>
+      <w:pPr>
+        <w:keepNext/>
+        <w:spacing w:after="200" w:before="360"/>
+      </w:pPr>
+      <w:r>
+        <w:rPr>
+          <w:rFonts w:ascii="Segoe UI" w:cs="Segoe UI" w:eastAsia="Segoe UI" w:hAnsi="Segoe UI"/>
+          <w:b/>
+          <w:bCs/>
+          <w:sz w:val="30"/>
+          <w:szCs w:val="30"/>
+        </w:rPr>
+        <w:t xml:space="preserve">8. GITHUB REPOSITORY SCREENSHOT AND LINK</w:t>
+      </w:r>
+    </w:p>
+    <w:p>
+      <w:pPr>
+        <w:spacing w:after="120"/>
+      </w:pPr>
+      <w:r>
+        <w:rPr>
+          <w:rFonts w:ascii="Segoe UI" w:cs="Segoe UI" w:eastAsia="Segoe UI" w:hAnsi="Segoe UI"/>
+          <w:b/>
+          <w:bCs/>
+          <w:sz w:val="21"/>
+          <w:szCs w:val="21"/>
+        </w:rPr>
+        <w:t xml:space="preserve">GitHub Repository Link:</w:t>
+      </w:r>
+      <w:r>
+        <w:rPr>
+          <w:rFonts w:ascii="Segoe UI" w:cs="Segoe UI" w:eastAsia="Segoe UI" w:hAnsi="Segoe UI"/>
+          <w:sz w:val="21"/>
+          <w:szCs w:val="21"/>
+        </w:rPr>
+        <w:t xml:space="preserve"> https://github.com/Jahnavi1110/bagtag</w:t>
+      </w:r>
+    </w:p>
+    <w:p>
+      <w:pPr>
+        <w:pBdr>
+          <w:bottom w:val="single" w:color="BFBFBF" w:sz="6" w:space="8"/>
+        </w:pBdr>
+        <w:spacing w:after="120" w:before="120"/>
+      </w:pPr>
+    </w:p>
+    <w:p>
+      <w:pPr>
+        <w:keepNext/>
+        <w:spacing w:after="80" w:before="120"/>
+      </w:pPr>
+      <w:r>
+        <w:rPr>
+          <w:rFonts w:ascii="Segoe UI" w:cs="Segoe UI" w:eastAsia="Segoe UI" w:hAnsi="Segoe UI"/>
+          <w:b/>
+          <w:bCs/>
+          <w:sz w:val="21"/>
+          <w:szCs w:val="21"/>
+        </w:rPr>
+        <w:t xml:space="preserve">Repository Screenshot:</w:t>
+      </w:r>
+    </w:p>
+    <w:p>
+      <w:pPr>
+        <w:keepNext w:val="false"/>
+        <w:spacing w:after="240"/>
+        <w:jc w:val="center"/>
+      </w:pPr>
+      <w:r>
+        <w:drawing>
+          <wp:inline distT="0" distB="0" distL="0" distR="0">
+            <wp:extent cx="4762500" cy="2981325"/>
+            <wp:effectExtent t="0" r="0" b="0" l="0"/>
+            <wp:docPr id="13" name="github-repo.png" descr="github-repo.png" title="github-repo.png"/>
+            <wp:cNvGraphicFramePr>
+              <a:graphicFrameLocks xmlns:a="http://schemas.openxmlformats.org/drawingml/2006/main" noChangeAspect="1"/>
+            </wp:cNvGraphicFramePr>
+            <a:graphic xmlns:a="http://schemas.openxmlformats.org/drawingml/2006/main">
+              <a:graphicData uri="http://schemas.openxmlformats.org/drawingml/2006/picture">
+                <pic:pic xmlns:pic="http://schemas.openxmlformats.org/drawingml/2006/picture">
+                  <pic:nvPicPr>
+                    <pic:cNvPr id="0" name="" descr=""/>
+                    <pic:cNvPicPr>
+                      <a:picLocks noChangeAspect="1" noChangeArrowheads="1"/>
+                    </pic:cNvPicPr>
+                  </pic:nvPicPr>
+                  <pic:blipFill>
+                    <a:blip r:embed="rId20" cstate="none"/>
+                    <a:srcRect/>
+                    <a:stretch>
+                      <a:fillRect/>
+                    </a:stretch>
+                  </pic:blipFill>
+                  <pic:spPr bwMode="auto">
+                    <a:xfrm>
+                      <a:off x="0" y="0"/>
                       <a:ext cx="4762500" cy="2981325"/>
                     </a:xfrm>
                     <a:prstGeom prst="rect">
@@ -4838,6 +5651,62 @@
     </w:p>
     <w:p>
       <w:pPr>
+        <w:pStyle w:val="ListParagraph"/>
+        <w:numPr>
+          <w:ilvl w:val="0"/>
+          <w:numId w:val="3"/>
+        </w:numPr>
+        <w:spacing w:after="100" w:line="276"/>
+      </w:pPr>
+      <w:r>
+        <w:rPr>
+          <w:rFonts w:ascii="Segoe UI" w:cs="Segoe UI" w:eastAsia="Segoe UI" w:hAnsi="Segoe UI"/>
+          <w:b/>
+          <w:bCs/>
+          <w:sz w:val="21"/>
+          <w:szCs w:val="21"/>
+        </w:rPr>
+        <w:t xml:space="preserve">Keeping the mascot's eye maths correct. </w:t>
+      </w:r>
+      <w:r>
+        <w:rPr>
+          <w:rFonts w:ascii="Segoe UI" w:cs="Segoe UI" w:eastAsia="Segoe UI" w:hAnsi="Segoe UI"/>
+          <w:sz w:val="21"/>
+          <w:szCs w:val="21"/>
+        </w:rPr>
+        <w:t xml:space="preserve">The pointer position is measured in screen pixels while the pupils move in SVG units, and Tagby is drawn at very different sizes. Dividing the pointer vector by the rendered pixels per SVG unit keeps the direction and the clamp correct at every size, which is covered by a unit test. In the first finder screenshot the worried Tagby looked up and to the left while the pointer was at the bottom right: the eye centres had been measured once on mount, and the self-hosted fonts loaded afterwards and shifted the layout without firing a resize or scroll event. The eyes are now re-measured whenever a new movement starts. The screenshot script also had to wait for React hydration before moving the pointer, because earlier movements were not seen by any listener.</w:t>
+      </w:r>
+    </w:p>
+    <w:p>
+      <w:pPr>
+        <w:pStyle w:val="ListParagraph"/>
+        <w:numPr>
+          <w:ilvl w:val="0"/>
+          <w:numId w:val="3"/>
+        </w:numPr>
+        <w:spacing w:after="100" w:line="276"/>
+      </w:pPr>
+      <w:r>
+        <w:rPr>
+          <w:rFonts w:ascii="Segoe UI" w:cs="Segoe UI" w:eastAsia="Segoe UI" w:hAnsi="Segoe UI"/>
+          <w:b/>
+          <w:bCs/>
+          <w:sz w:val="21"/>
+          <w:szCs w:val="21"/>
+        </w:rPr>
+        <w:t xml:space="preserve">Avoiding a constantly running animation loop, and a build error. </w:t>
+      </w:r>
+      <w:r>
+        <w:rPr>
+          <w:rFonts w:ascii="Segoe UI" w:cs="Segoe UI" w:eastAsia="Segoe UI" w:hAnsi="Segoe UI"/>
+          <w:sz w:val="21"/>
+          <w:szCs w:val="21"/>
+        </w:rPr>
+        <w:t xml:space="preserve">A naive requestAnimationFrame loop would run sixty times a second for every mascot on the page. The loop is therefore started only by pointer movement or an idle glance and stops once the pupils reach their target; bobbing and blinking use CSS. A rebuild then failed with 'EINVAL: readlink' inside the .next folder because OneDrive had converted build output into cloud placeholders; deleting the .next folder resolved it. Finally, loading only the 400 weight of DM Sans with font synthesis disabled silently removed the bold weight from item names on the printed tags; this was caught while checking the exported PNG in this report, and the tag templates now use Epilogue 900 for item names.</w:t>
+      </w:r>
+    </w:p>
+    <w:p>
+      <w:pPr>
         <w:pBdr>
           <w:bottom w:val="single" w:color="BFBFBF" w:sz="6" w:space="8"/>
         </w:pBdr>
@@ -4987,7 +5856,7 @@
           <w:sz w:val="21"/>
           <w:szCs w:val="21"/>
         </w:rPr>
-        <w:t xml:space="preserve">The project produced Tagback, a working full-stack web application that lets owners create printable QR tags in five formats and lets finders contact them through an anonymous, two-way relay. All core features were implemented and tested: authentication, the dashboard, the tag maker with live preview, PNG, PDF and A4 export, status management, the public finder page with a Lost alert and opt-in location, and the private finder chat. Neither party's identity is exposed: owners' contact details are never sent to finders, and finders are identified only by the hash of a random token. The 25 unit tests and the end-to-end smoke test pass against the local database. Planned extensions include email notifications, real-time chat and deployment to a hosted environment.</w:t>
+        <w:t xml:space="preserve">The project produced Tagback, a working full-stack web application that lets owners create printable QR tags in five formats and lets finders contact them through an anonymous, two-way relay. All core features were implemented and tested: authentication, the dashboard, the tag maker with live preview, PNG, PDF and A4 export, status management, the public finder page with a Lost alert and opt-in location, and the private finder chat. Neither party's identity is exposed: owners' contact details are never sent to finders, and finders are identified only by the hash of a random token. A playful landing page and the animated Tagby mascot give the interface a friendly identity while respecting reduced-motion preferences. The 30 unit tests and the end-to-end smoke test pass against the local database. Planned extensions include email notifications, real-time chat and deployment to a hosted environment.</w:t>
       </w:r>
     </w:p>
     <w:p>

</xml_diff>

<commit_message>
docs(report): use the college AAT-1 cover sheet as the first page
Co-Authored-By: Claude Opus 5.5 <noreply@anthropic.com>
</commit_message>
<xml_diff>
--- a/report/AAT1_Report.docx
+++ b/report/AAT1_Report.docx
@@ -2,221 +2,719 @@
 <file path=word/document.xml><?xml version="1.0" encoding="utf-8"?>
 <w:document xmlns:wpc="http://schemas.microsoft.com/office/word/2010/wordprocessingCanvas" xmlns:mc="http://schemas.openxmlformats.org/markup-compatibility/2006" xmlns:o="urn:schemas-microsoft-com:office:office" xmlns:r="http://schemas.openxmlformats.org/officeDocument/2006/relationships" xmlns:m="http://schemas.openxmlformats.org/officeDocument/2006/math" xmlns:v="urn:schemas-microsoft-com:vml" xmlns:wp14="http://schemas.microsoft.com/office/word/2010/wordprocessingDrawing" xmlns:wp="http://schemas.openxmlformats.org/drawingml/2006/wordprocessingDrawing" xmlns:w10="urn:schemas-microsoft-com:office:word" xmlns:w="http://schemas.openxmlformats.org/wordprocessingml/2006/main" xmlns:w14="http://schemas.microsoft.com/office/word/2010/wordml" xmlns:w15="http://schemas.microsoft.com/office/word/2012/wordml" xmlns:wpg="http://schemas.microsoft.com/office/word/2010/wordprocessingGroup" xmlns:wpi="http://schemas.microsoft.com/office/word/2010/wordprocessingInk" xmlns:wne="http://schemas.microsoft.com/office/word/2006/wordml" xmlns:wps="http://schemas.microsoft.com/office/word/2010/wordprocessingShape" xmlns:cx="http://schemas.microsoft.com/office/drawing/2014/chartex" xmlns:cx1="http://schemas.microsoft.com/office/drawing/2015/9/8/chartex" xmlns:cx2="http://schemas.microsoft.com/office/drawing/2015/10/21/chartex" xmlns:cx3="http://schemas.microsoft.com/office/drawing/2016/5/9/chartex" xmlns:cx4="http://schemas.microsoft.com/office/drawing/2016/5/10/chartex" xmlns:cx5="http://schemas.microsoft.com/office/drawing/2016/5/11/chartex" xmlns:cx6="http://schemas.microsoft.com/office/drawing/2016/5/12/chartex" xmlns:cx7="http://schemas.microsoft.com/office/drawing/2016/5/13/chartex" xmlns:cx8="http://schemas.microsoft.com/office/drawing/2016/5/14/chartex" xmlns:aink="http://schemas.microsoft.com/office/drawing/2016/ink" xmlns:am3d="http://schemas.microsoft.com/office/drawing/2017/model3d" xmlns:w16cex="http://schemas.microsoft.com/office/word/2018/wordml/cex" xmlns:w16cid="http://schemas.microsoft.com/office/word/2016/wordml/cid" xmlns:w16="http://schemas.microsoft.com/office/word/2018/wordml" xmlns:w16sdtdh="http://schemas.microsoft.com/office/word/2020/wordml/sdtdatahash" xmlns:w16se="http://schemas.microsoft.com/office/word/2015/wordml/symex" mc:Ignorable="w14 w15 wp14">
   <w:body>
-    <w:p>
-      <w:pPr>
-        <w:spacing w:after="280" w:before="0"/>
-      </w:pPr>
-      <w:r>
-        <w:rPr>
-          <w:rFonts w:ascii="Segoe UI" w:cs="Segoe UI" w:eastAsia="Segoe UI" w:hAnsi="Segoe UI"/>
+    <w:tbl>
+      <w:tblPr>
+        <w:tblW w:type="dxa" w:w="10279"/>
+        <w:tblBorders>
+          <w:top w:val="single" w:color="auto" w:sz="4"/>
+          <w:left w:val="single" w:color="auto" w:sz="4"/>
+          <w:bottom w:val="single" w:color="auto" w:sz="4"/>
+          <w:right w:val="single" w:color="auto" w:sz="4"/>
+          <w:insideH w:val="single" w:color="auto" w:sz="4"/>
+          <w:insideV w:val="single" w:color="auto" w:sz="4"/>
+        </w:tblBorders>
+      </w:tblPr>
+      <w:tblGrid>
+        <w:gridCol w:w="977"/>
+        <w:gridCol w:w="1019"/>
+        <w:gridCol w:w="1002"/>
+        <w:gridCol w:w="1030"/>
+        <w:gridCol w:w="2287"/>
+        <w:gridCol w:w="1530"/>
+        <w:gridCol w:w="2434"/>
+      </w:tblGrid>
+      <w:tr>
+        <w:trPr>
+          <w:cantSplit/>
+          <w:trHeight w:val="1296" w:hRule="exact"/>
+        </w:trPr>
+        <w:tc>
+          <w:tcPr>
+            <w:tcW w:type="dxa" w:w="10279"/>
+            <w:gridSpan w:val="7"/>
+            <w:tcBorders>
+              <w:top w:val="single" w:color="000000" w:sz="6"/>
+              <w:left w:val="single" w:color="000000" w:sz="6"/>
+              <w:bottom w:val="single" w:color="000000" w:sz="6"/>
+              <w:right w:val="single" w:color="000000" w:sz="6"/>
+            </w:tcBorders>
+            <w:tcMar>
+              <w:top w:type="dxa" w:w="0"/>
+              <w:left w:type="dxa" w:w="115"/>
+              <w:bottom w:type="dxa" w:w="0"/>
+              <w:right w:type="dxa" w:w="115"/>
+            </w:tcMar>
+            <w:vAlign w:val="center"/>
+          </w:tcPr>
+          <w:p>
+            <w:pPr>
+              <w:jc w:val="center"/>
+            </w:pPr>
+            <w:r>
+              <w:drawing>
+                <wp:inline distT="0" distB="0" distL="0" distR="0">
+                  <wp:extent cx="5619750" cy="638175"/>
+                  <wp:effectExtent t="0" r="0" b="0" l="0"/>
+                  <wp:docPr id="1" name="college-logo.jpeg" descr="College logo" title="College logo"/>
+                  <wp:cNvGraphicFramePr>
+                    <a:graphicFrameLocks xmlns:a="http://schemas.openxmlformats.org/drawingml/2006/main" noChangeAspect="1"/>
+                  </wp:cNvGraphicFramePr>
+                  <a:graphic xmlns:a="http://schemas.openxmlformats.org/drawingml/2006/main">
+                    <a:graphicData uri="http://schemas.openxmlformats.org/drawingml/2006/picture">
+                      <pic:pic xmlns:pic="http://schemas.openxmlformats.org/drawingml/2006/picture">
+                        <pic:nvPicPr>
+                          <pic:cNvPr id="0" name="" descr=""/>
+                          <pic:cNvPicPr>
+                            <a:picLocks noChangeAspect="1" noChangeArrowheads="1"/>
+                          </pic:cNvPicPr>
+                        </pic:nvPicPr>
+                        <pic:blipFill>
+                          <a:blip r:embed="rId8" cstate="none"/>
+                          <a:srcRect/>
+                          <a:stretch>
+                            <a:fillRect/>
+                          </a:stretch>
+                        </pic:blipFill>
+                        <pic:spPr bwMode="auto">
+                          <a:xfrm>
+                            <a:off x="0" y="0"/>
+                            <a:ext cx="5619750" cy="638175"/>
+                          </a:xfrm>
+                          <a:prstGeom prst="rect">
+                            <a:avLst/>
+                          </a:prstGeom>
+                        </pic:spPr>
+                      </pic:pic>
+                    </a:graphicData>
+                  </a:graphic>
+                </wp:inline>
+              </w:drawing>
+            </w:r>
+          </w:p>
+        </w:tc>
+      </w:tr>
+      <w:tr>
+        <w:trPr>
+          <w:cantSplit/>
+          <w:trHeight w:val="948" w:hRule="exact"/>
+        </w:trPr>
+        <w:tc>
+          <w:tcPr>
+            <w:tcW w:type="dxa" w:w="10279"/>
+            <w:gridSpan w:val="7"/>
+            <w:tcBorders>
+              <w:top w:val="single" w:color="000000" w:sz="6"/>
+              <w:left w:val="single" w:color="000000" w:sz="6"/>
+              <w:bottom w:val="single" w:color="000000" w:sz="6"/>
+              <w:right w:val="single" w:color="000000" w:sz="6"/>
+            </w:tcBorders>
+            <w:tcMar>
+              <w:top w:type="dxa" w:w="0"/>
+              <w:left w:type="dxa" w:w="115"/>
+              <w:bottom w:type="dxa" w:w="0"/>
+              <w:right w:type="dxa" w:w="115"/>
+            </w:tcMar>
+            <w:vAlign w:val="center"/>
+          </w:tcPr>
+          <w:p>
+            <w:pPr>
+              <w:jc w:val="left"/>
+            </w:pPr>
+            <w:r>
+              <w:rPr>
+                <w:rFonts w:ascii="Cambria" w:cs="Cambria" w:eastAsia="Cambria" w:hAnsi="Cambria"/>
+                <w:b/>
+                <w:bCs/>
+                <w:sz w:val="24"/>
+                <w:szCs w:val="24"/>
+              </w:rPr>
+              <w:t xml:space="preserve">Department: Computer Science and Engineering</w:t>
+            </w:r>
+          </w:p>
+        </w:tc>
+      </w:tr>
+      <w:tr>
+        <w:trPr>
+          <w:cantSplit/>
+          <w:trHeight w:val="1321" w:hRule="exact"/>
+        </w:trPr>
+        <w:tc>
+          <w:tcPr>
+            <w:tcW w:type="dxa" w:w="10279"/>
+            <w:gridSpan w:val="7"/>
+            <w:tcBorders>
+              <w:top w:val="single" w:color="000000" w:sz="6"/>
+              <w:left w:val="single" w:color="000000" w:sz="6"/>
+              <w:bottom w:val="single" w:color="000000" w:sz="6"/>
+              <w:right w:val="single" w:color="000000" w:sz="6"/>
+            </w:tcBorders>
+            <w:tcMar>
+              <w:top w:type="dxa" w:w="0"/>
+              <w:left w:type="dxa" w:w="115"/>
+              <w:bottom w:type="dxa" w:w="0"/>
+              <w:right w:type="dxa" w:w="115"/>
+            </w:tcMar>
+            <w:vAlign w:val="center"/>
+          </w:tcPr>
+          <w:p>
+            <w:pPr>
+              <w:jc w:val="left"/>
+            </w:pPr>
+            <w:r>
+              <w:rPr>
+                <w:rFonts w:ascii="Cambria" w:cs="Cambria" w:eastAsia="Cambria" w:hAnsi="Cambria"/>
+                <w:b/>
+                <w:bCs/>
+                <w:sz w:val="24"/>
+                <w:szCs w:val="24"/>
+              </w:rPr>
+              <w:t xml:space="preserve">Academic Semester: Aug 2026– Dec 2026</w:t>
+            </w:r>
+          </w:p>
+        </w:tc>
+      </w:tr>
+      <w:tr>
+        <w:trPr>
+          <w:cantSplit/>
+          <w:trHeight w:val="1423" w:hRule="exact"/>
+        </w:trPr>
+        <w:tc>
+          <w:tcPr>
+            <w:tcW w:type="dxa" w:w="1996"/>
+            <w:gridSpan w:val="2"/>
+            <w:tcBorders>
+              <w:top w:val="single" w:color="000000" w:sz="6"/>
+              <w:left w:val="single" w:color="000000" w:sz="6"/>
+              <w:bottom w:val="single" w:color="000000" w:sz="6"/>
+              <w:right w:val="single" w:color="000000" w:sz="6"/>
+            </w:tcBorders>
+            <w:shd w:fill="D3DFEE" w:color="auto" w:val="clear"/>
+            <w:tcMar>
+              <w:top w:type="dxa" w:w="0"/>
+              <w:left w:type="dxa" w:w="115"/>
+              <w:bottom w:type="dxa" w:w="0"/>
+              <w:right w:type="dxa" w:w="115"/>
+            </w:tcMar>
+            <w:vAlign w:val="center"/>
+          </w:tcPr>
+          <w:p>
+            <w:r>
+              <w:rPr>
+                <w:rFonts w:ascii="Cambria" w:cs="Cambria" w:eastAsia="Cambria" w:hAnsi="Cambria"/>
+                <w:b/>
+                <w:bCs/>
+                <w:sz w:val="24"/>
+                <w:szCs w:val="24"/>
+              </w:rPr>
+              <w:t xml:space="preserve">Semester: 7</w:t>
+            </w:r>
+            <w:r>
+              <w:rPr>
+                <w:rFonts w:ascii="Cambria" w:cs="Cambria" w:eastAsia="Cambria" w:hAnsi="Cambria"/>
+                <w:b/>
+                <w:bCs/>
+                <w:sz w:val="24"/>
+                <w:szCs w:val="24"/>
+                <w:vertAlign w:val="superscript"/>
+              </w:rPr>
+              <w:t xml:space="preserve">th</w:t>
+            </w:r>
+          </w:p>
+        </w:tc>
+        <w:tc>
+          <w:tcPr>
+            <w:tcW w:type="dxa" w:w="2032"/>
+            <w:gridSpan w:val="2"/>
+            <w:tcBorders>
+              <w:top w:val="single" w:color="000000" w:sz="6"/>
+              <w:left w:val="single" w:color="000000" w:sz="6"/>
+              <w:bottom w:val="single" w:color="000000" w:sz="6"/>
+              <w:right w:val="single" w:color="000000" w:sz="6"/>
+            </w:tcBorders>
+            <w:shd w:fill="D3DFEE" w:color="auto" w:val="clear"/>
+            <w:tcMar>
+              <w:top w:type="dxa" w:w="0"/>
+              <w:left w:type="dxa" w:w="115"/>
+              <w:bottom w:type="dxa" w:w="0"/>
+              <w:right w:type="dxa" w:w="115"/>
+            </w:tcMar>
+            <w:vAlign w:val="center"/>
+          </w:tcPr>
+          <w:p>
+            <w:pPr>
+              <w:jc w:val="left"/>
+            </w:pPr>
+            <w:r>
+              <w:rPr>
+                <w:rFonts w:ascii="Cambria" w:cs="Cambria" w:eastAsia="Cambria" w:hAnsi="Cambria"/>
+                <w:b/>
+                <w:bCs/>
+                <w:sz w:val="24"/>
+                <w:szCs w:val="24"/>
+              </w:rPr>
+              <w:t xml:space="preserve">Section: B</w:t>
+            </w:r>
+          </w:p>
+        </w:tc>
+        <w:tc>
+          <w:tcPr>
+            <w:tcW w:type="dxa" w:w="2287"/>
+            <w:gridSpan w:val="1"/>
+            <w:tcBorders>
+              <w:top w:val="single" w:color="000000" w:sz="6"/>
+              <w:left w:val="single" w:color="000000" w:sz="6"/>
+              <w:bottom w:val="single" w:color="000000" w:sz="6"/>
+              <w:right w:val="single" w:color="000000" w:sz="6"/>
+            </w:tcBorders>
+            <w:shd w:fill="D3DFEE" w:color="auto" w:val="clear"/>
+            <w:tcMar>
+              <w:top w:type="dxa" w:w="0"/>
+              <w:left w:type="dxa" w:w="115"/>
+              <w:bottom w:type="dxa" w:w="0"/>
+              <w:right w:type="dxa" w:w="115"/>
+            </w:tcMar>
+            <w:vAlign w:val="center"/>
+          </w:tcPr>
+          <w:p>
+            <w:pPr>
+              <w:jc w:val="left"/>
+            </w:pPr>
+            <w:r>
+              <w:rPr>
+                <w:rFonts w:ascii="Cambria" w:cs="Cambria" w:eastAsia="Cambria" w:hAnsi="Cambria"/>
+                <w:b/>
+                <w:bCs/>
+                <w:sz w:val="24"/>
+                <w:szCs w:val="24"/>
+              </w:rPr>
+              <w:t xml:space="preserve">Course Code: 22CSE71</w:t>
+            </w:r>
+          </w:p>
+        </w:tc>
+        <w:tc>
+          <w:tcPr>
+            <w:tcW w:type="dxa" w:w="3964"/>
+            <w:gridSpan w:val="2"/>
+            <w:tcBorders>
+              <w:top w:val="single" w:color="000000" w:sz="6"/>
+              <w:left w:val="single" w:color="000000" w:sz="6"/>
+              <w:bottom w:val="single" w:color="000000" w:sz="6"/>
+              <w:right w:val="single" w:color="000000" w:sz="6"/>
+            </w:tcBorders>
+            <w:shd w:fill="D3DFEE" w:color="auto" w:val="clear"/>
+            <w:tcMar>
+              <w:top w:type="dxa" w:w="0"/>
+              <w:left w:type="dxa" w:w="115"/>
+              <w:bottom w:type="dxa" w:w="0"/>
+              <w:right w:type="dxa" w:w="115"/>
+            </w:tcMar>
+            <w:vAlign w:val="center"/>
+          </w:tcPr>
+          <w:p>
+            <w:pPr>
+              <w:jc w:val="left"/>
+            </w:pPr>
+            <w:r>
+              <w:rPr>
+                <w:rFonts w:ascii="Cambria" w:cs="Cambria" w:eastAsia="Cambria" w:hAnsi="Cambria"/>
+                <w:b/>
+                <w:bCs/>
+                <w:sz w:val="24"/>
+                <w:szCs w:val="24"/>
+              </w:rPr>
+              <w:t xml:space="preserve">Course: Full Stack Technologies</w:t>
+            </w:r>
+          </w:p>
+        </w:tc>
+      </w:tr>
+      <w:tr>
+        <w:trPr>
+          <w:cantSplit/>
+          <w:trHeight w:val="2485" w:hRule="exact"/>
+        </w:trPr>
+        <w:tc>
+          <w:tcPr>
+            <w:tcW w:type="dxa" w:w="10279"/>
+            <w:gridSpan w:val="7"/>
+            <w:tcBorders>
+              <w:top w:val="single" w:color="4472C4" w:sz="12"/>
+              <w:left w:val="single" w:color="4472C4" w:sz="12"/>
+              <w:bottom w:val="single" w:color="4472C4" w:sz="12"/>
+              <w:right w:val="single" w:color="4472C4" w:sz="12"/>
+            </w:tcBorders>
+            <w:tcMar>
+              <w:top w:type="dxa" w:w="0"/>
+              <w:left w:type="dxa" w:w="115"/>
+              <w:bottom w:type="dxa" w:w="0"/>
+              <w:right w:type="dxa" w:w="115"/>
+            </w:tcMar>
+            <w:vAlign w:val="center"/>
+          </w:tcPr>
+          <w:p>
+            <w:pPr>
+              <w:spacing w:after="200"/>
+            </w:pPr>
+            <w:r>
+              <w:rPr>
+                <w:rFonts w:ascii="Cambria" w:cs="Cambria" w:eastAsia="Cambria" w:hAnsi="Cambria"/>
+                <w:b/>
+                <w:bCs/>
+                <w:sz w:val="24"/>
+                <w:szCs w:val="24"/>
+              </w:rPr>
+              <w:t xml:space="preserve">AAT1: PORTFOLIO-DRIVEN</w:t>
+            </w:r>
+          </w:p>
+          <w:p>
+            <w:r>
+              <w:rPr>
+                <w:rFonts w:ascii="Cambria" w:cs="Cambria" w:eastAsia="Cambria" w:hAnsi="Cambria"/>
+                <w:b/>
+                <w:bCs/>
+                <w:sz w:val="24"/>
+                <w:szCs w:val="24"/>
+              </w:rPr>
+              <w:t xml:space="preserve">Topic: </w:t>
+            </w:r>
+            <w:r>
+              <w:rPr>
+                <w:rFonts w:ascii="Cambria" w:cs="Cambria" w:eastAsia="Cambria" w:hAnsi="Cambria"/>
+                <w:b w:val="false"/>
+                <w:bCs w:val="false"/>
+                <w:sz w:val="24"/>
+                <w:szCs w:val="24"/>
+              </w:rPr>
+              <w:t xml:space="preserve">Tagback: Privacy-Preserving QR Bag Tags for Lost-Item Recovery</w:t>
+            </w:r>
+          </w:p>
+        </w:tc>
+      </w:tr>
+      <w:tr>
+        <w:trPr>
+          <w:cantSplit/>
+          <w:trHeight w:val="1057" w:hRule="exact"/>
+        </w:trPr>
+        <w:tc>
+          <w:tcPr>
+            <w:tcW w:type="dxa" w:w="977"/>
+            <w:gridSpan w:val="1"/>
+            <w:tcBorders>
+              <w:top w:val="single" w:color="000000" w:sz="6"/>
+              <w:left w:val="single" w:color="000000" w:sz="6"/>
+              <w:bottom w:val="single" w:color="000000" w:sz="6"/>
+              <w:right w:val="single" w:color="000000" w:sz="6"/>
+            </w:tcBorders>
+            <w:shd w:fill="D3DFEE" w:color="auto" w:val="clear"/>
+            <w:tcMar>
+              <w:top w:type="dxa" w:w="0"/>
+              <w:left w:type="dxa" w:w="115"/>
+              <w:bottom w:type="dxa" w:w="0"/>
+              <w:right w:type="dxa" w:w="115"/>
+            </w:tcMar>
+            <w:vAlign w:val="center"/>
+          </w:tcPr>
+          <w:p>
+            <w:pPr>
+              <w:jc w:val="center"/>
+            </w:pPr>
+            <w:r>
+              <w:rPr>
+                <w:rFonts w:ascii="Cambria" w:cs="Cambria" w:eastAsia="Cambria" w:hAnsi="Cambria"/>
+                <w:b/>
+                <w:bCs/>
+                <w:sz w:val="24"/>
+                <w:szCs w:val="24"/>
+              </w:rPr>
+              <w:t xml:space="preserve">Sl. No.</w:t>
+            </w:r>
+          </w:p>
+        </w:tc>
+        <w:tc>
+          <w:tcPr>
+            <w:tcW w:type="dxa" w:w="2021"/>
+            <w:gridSpan w:val="2"/>
+            <w:tcBorders>
+              <w:top w:val="single" w:color="000000" w:sz="6"/>
+              <w:left w:val="single" w:color="000000" w:sz="6"/>
+              <w:bottom w:val="single" w:color="000000" w:sz="6"/>
+              <w:right w:val="single" w:color="000000" w:sz="6"/>
+            </w:tcBorders>
+            <w:shd w:fill="D3DFEE" w:color="auto" w:val="clear"/>
+            <w:tcMar>
+              <w:top w:type="dxa" w:w="0"/>
+              <w:left w:type="dxa" w:w="115"/>
+              <w:bottom w:type="dxa" w:w="0"/>
+              <w:right w:type="dxa" w:w="115"/>
+            </w:tcMar>
+            <w:vAlign w:val="center"/>
+          </w:tcPr>
+          <w:p>
+            <w:pPr>
+              <w:jc w:val="center"/>
+            </w:pPr>
+            <w:r>
+              <w:rPr>
+                <w:rFonts w:ascii="Cambria" w:cs="Cambria" w:eastAsia="Cambria" w:hAnsi="Cambria"/>
+                <w:b/>
+                <w:bCs/>
+                <w:sz w:val="24"/>
+                <w:szCs w:val="24"/>
+              </w:rPr>
+              <w:t xml:space="preserve">USN</w:t>
+            </w:r>
+          </w:p>
+        </w:tc>
+        <w:tc>
+          <w:tcPr>
+            <w:tcW w:type="dxa" w:w="4847"/>
+            <w:gridSpan w:val="3"/>
+            <w:tcBorders>
+              <w:top w:val="single" w:color="000000" w:sz="6"/>
+              <w:left w:val="single" w:color="000000" w:sz="6"/>
+              <w:bottom w:val="single" w:color="000000" w:sz="6"/>
+              <w:right w:val="single" w:color="000000" w:sz="6"/>
+            </w:tcBorders>
+            <w:shd w:fill="D3DFEE" w:color="auto" w:val="clear"/>
+            <w:tcMar>
+              <w:top w:type="dxa" w:w="0"/>
+              <w:left w:type="dxa" w:w="115"/>
+              <w:bottom w:type="dxa" w:w="0"/>
+              <w:right w:type="dxa" w:w="115"/>
+            </w:tcMar>
+            <w:vAlign w:val="center"/>
+          </w:tcPr>
+          <w:p>
+            <w:pPr>
+              <w:jc w:val="center"/>
+            </w:pPr>
+            <w:r>
+              <w:rPr>
+                <w:rFonts w:ascii="Cambria" w:cs="Cambria" w:eastAsia="Cambria" w:hAnsi="Cambria"/>
+                <w:b/>
+                <w:bCs/>
+                <w:sz w:val="24"/>
+                <w:szCs w:val="24"/>
+              </w:rPr>
+              <w:t xml:space="preserve">Student Name</w:t>
+            </w:r>
+          </w:p>
+        </w:tc>
+        <w:tc>
+          <w:tcPr>
+            <w:tcW w:type="dxa" w:w="2434"/>
+            <w:gridSpan w:val="1"/>
+            <w:tcBorders>
+              <w:top w:val="single" w:color="000000" w:sz="6"/>
+              <w:left w:val="single" w:color="000000" w:sz="6"/>
+              <w:bottom w:val="single" w:color="000000" w:sz="6"/>
+              <w:right w:val="single" w:color="000000" w:sz="6"/>
+            </w:tcBorders>
+            <w:shd w:fill="D3DFEE" w:color="auto" w:val="clear"/>
+            <w:tcMar>
+              <w:top w:type="dxa" w:w="0"/>
+              <w:left w:type="dxa" w:w="115"/>
+              <w:bottom w:type="dxa" w:w="0"/>
+              <w:right w:type="dxa" w:w="115"/>
+            </w:tcMar>
+            <w:vAlign w:val="center"/>
+          </w:tcPr>
+          <w:p>
+            <w:pPr>
+              <w:jc w:val="center"/>
+            </w:pPr>
+            <w:r>
+              <w:rPr>
+                <w:rFonts w:ascii="Cambria" w:cs="Cambria" w:eastAsia="Cambria" w:hAnsi="Cambria"/>
+                <w:b/>
+                <w:bCs/>
+                <w:sz w:val="24"/>
+                <w:szCs w:val="24"/>
+              </w:rPr>
+              <w:t xml:space="preserve">Total</w:t>
+            </w:r>
+          </w:p>
+          <w:p>
+            <w:pPr>
+              <w:jc w:val="center"/>
+            </w:pPr>
+            <w:r>
+              <w:rPr>
+                <w:rFonts w:ascii="Cambria" w:cs="Cambria" w:eastAsia="Cambria" w:hAnsi="Cambria"/>
+                <w:b/>
+                <w:bCs/>
+                <w:sz w:val="24"/>
+                <w:szCs w:val="24"/>
+              </w:rPr>
+              <w:t xml:space="preserve">(15 marks)</w:t>
+            </w:r>
+          </w:p>
+        </w:tc>
+      </w:tr>
+      <w:tr>
+        <w:trPr>
+          <w:cantSplit/>
+          <w:trHeight w:val="1296" w:hRule="exact"/>
+        </w:trPr>
+        <w:tc>
+          <w:tcPr>
+            <w:tcW w:type="dxa" w:w="977"/>
+            <w:gridSpan w:val="1"/>
+            <w:tcBorders>
+              <w:top w:val="single" w:color="000000" w:sz="6"/>
+              <w:left w:val="single" w:color="000000" w:sz="6"/>
+              <w:bottom w:val="single" w:color="000000" w:sz="6"/>
+              <w:right w:val="single" w:color="000000" w:sz="6"/>
+            </w:tcBorders>
+            <w:tcMar>
+              <w:top w:type="dxa" w:w="0"/>
+              <w:left w:type="dxa" w:w="115"/>
+              <w:bottom w:type="dxa" w:w="0"/>
+              <w:right w:type="dxa" w:w="115"/>
+            </w:tcMar>
+            <w:vAlign w:val="center"/>
+          </w:tcPr>
+          <w:p>
+            <w:pPr>
+              <w:jc w:val="center"/>
+            </w:pPr>
+            <w:r>
+              <w:rPr>
+                <w:rFonts w:ascii="Cambria" w:cs="Cambria" w:eastAsia="Cambria" w:hAnsi="Cambria"/>
+                <w:b/>
+                <w:bCs/>
+                <w:sz w:val="24"/>
+                <w:szCs w:val="24"/>
+              </w:rPr>
+              <w:t xml:space="preserve">1.</w:t>
+            </w:r>
+          </w:p>
+        </w:tc>
+        <w:tc>
+          <w:tcPr>
+            <w:tcW w:type="dxa" w:w="2021"/>
+            <w:gridSpan w:val="2"/>
+            <w:tcBorders>
+              <w:top w:val="single" w:color="000000" w:sz="6"/>
+              <w:left w:val="single" w:color="000000" w:sz="6"/>
+              <w:bottom w:val="single" w:color="000000" w:sz="6"/>
+              <w:right w:val="single" w:color="000000" w:sz="6"/>
+            </w:tcBorders>
+            <w:tcMar>
+              <w:top w:type="dxa" w:w="0"/>
+              <w:left w:type="dxa" w:w="115"/>
+              <w:bottom w:type="dxa" w:w="0"/>
+              <w:right w:type="dxa" w:w="115"/>
+            </w:tcMar>
+            <w:vAlign w:val="center"/>
+          </w:tcPr>
+          <w:p>
+            <w:pPr>
+              <w:jc w:val="center"/>
+            </w:pPr>
+            <w:r>
+              <w:rPr>
+                <w:rFonts w:ascii="Cambria" w:cs="Cambria" w:eastAsia="Cambria" w:hAnsi="Cambria"/>
+                <w:b/>
+                <w:bCs/>
+                <w:sz w:val="24"/>
+                <w:szCs w:val="24"/>
+              </w:rPr>
+              <w:t xml:space="preserve"/>
+            </w:r>
+          </w:p>
+        </w:tc>
+        <w:tc>
+          <w:tcPr>
+            <w:tcW w:type="dxa" w:w="4847"/>
+            <w:gridSpan w:val="3"/>
+            <w:tcBorders>
+              <w:top w:val="single" w:color="000000" w:sz="6"/>
+              <w:left w:val="single" w:color="000000" w:sz="6"/>
+              <w:bottom w:val="single" w:color="000000" w:sz="6"/>
+              <w:right w:val="single" w:color="000000" w:sz="6"/>
+            </w:tcBorders>
+            <w:tcMar>
+              <w:top w:type="dxa" w:w="0"/>
+              <w:left w:type="dxa" w:w="115"/>
+              <w:bottom w:type="dxa" w:w="0"/>
+              <w:right w:type="dxa" w:w="115"/>
+            </w:tcMar>
+            <w:vAlign w:val="center"/>
+          </w:tcPr>
+          <w:p>
+            <w:pPr>
+              <w:jc w:val="center"/>
+            </w:pPr>
+            <w:r>
+              <w:rPr>
+                <w:rFonts w:ascii="Cambria" w:cs="Cambria" w:eastAsia="Cambria" w:hAnsi="Cambria"/>
+                <w:b/>
+                <w:bCs/>
+                <w:sz w:val="24"/>
+                <w:szCs w:val="24"/>
+              </w:rPr>
+              <w:t xml:space="preserve"/>
+            </w:r>
+          </w:p>
+        </w:tc>
+        <w:tc>
+          <w:tcPr>
+            <w:tcW w:type="dxa" w:w="2434"/>
+            <w:gridSpan w:val="1"/>
+            <w:tcBorders>
+              <w:top w:val="single" w:color="000000" w:sz="6"/>
+              <w:left w:val="single" w:color="000000" w:sz="6"/>
+              <w:bottom w:val="single" w:color="000000" w:sz="6"/>
+              <w:right w:val="single" w:color="000000" w:sz="6"/>
+            </w:tcBorders>
+            <w:tcMar>
+              <w:top w:type="dxa" w:w="0"/>
+              <w:left w:type="dxa" w:w="115"/>
+              <w:bottom w:type="dxa" w:w="0"/>
+              <w:right w:type="dxa" w:w="115"/>
+            </w:tcMar>
+            <w:vAlign w:val="center"/>
+          </w:tcPr>
+          <w:p>
+            <w:pPr>
+              <w:jc w:val="left"/>
+            </w:pPr>
+            <w:r>
+              <w:rPr>
+                <w:rFonts w:ascii="Cambria" w:cs="Cambria" w:eastAsia="Cambria" w:hAnsi="Cambria"/>
+                <w:b/>
+                <w:bCs/>
+                <w:sz w:val="24"/>
+                <w:szCs w:val="24"/>
+              </w:rPr>
+              <w:t xml:space="preserve"/>
+            </w:r>
+          </w:p>
+        </w:tc>
+      </w:tr>
+    </w:tbl>
+    <w:p>
+      <w:pPr>
+        <w:spacing w:before="2000"/>
+        <w:ind w:right="400"/>
+        <w:jc w:val="right"/>
+        <w:sectPr>
+          <w:pgSz w:w="12240" w:h="15840" w:orient="portrait"/>
+          <w:pgMar w:top="1440" w:right="1440" w:bottom="1440" w:left="1440" w:header="708" w:footer="708" w:gutter="0"/>
+          <w:pgNumType/>
+          <w:docGrid w:linePitch="360"/>
+        </w:sectPr>
+      </w:pPr>
+      <w:r>
+        <w:rPr>
+          <w:rFonts w:ascii="Cambria" w:cs="Cambria" w:eastAsia="Cambria" w:hAnsi="Cambria"/>
           <w:b/>
           <w:bCs/>
-          <w:sz w:val="40"/>
-          <w:szCs w:val="40"/>
-        </w:rPr>
-        <w:t xml:space="preserve">ALTERNATIVE ASSESSMENT TEST – 1</w:t>
-      </w:r>
-    </w:p>
-    <w:p>
-      <w:pPr>
-        <w:spacing w:after="240" w:before="0"/>
-      </w:pPr>
-      <w:r>
-        <w:rPr>
-          <w:rFonts w:ascii="Segoe UI" w:cs="Segoe UI" w:eastAsia="Segoe UI" w:hAnsi="Segoe UI"/>
-          <w:b/>
-          <w:bCs/>
-          <w:sz w:val="30"/>
-          <w:szCs w:val="30"/>
-        </w:rPr>
-        <w:t xml:space="preserve">PORTFOLIO-DRIVEN DEVELOPMENT</w:t>
-      </w:r>
-    </w:p>
-    <w:p>
-      <w:pPr>
-        <w:spacing w:after="240" w:before="0"/>
-      </w:pPr>
-      <w:r>
-        <w:rPr>
-          <w:rFonts w:ascii="Segoe UI" w:cs="Segoe UI" w:eastAsia="Segoe UI" w:hAnsi="Segoe UI"/>
-          <w:b/>
-          <w:bCs/>
-          <w:sz w:val="24"/>
-          <w:szCs w:val="24"/>
-        </w:rPr>
-        <w:t xml:space="preserve">PROJECT REPORT</w:t>
-      </w:r>
-    </w:p>
-    <w:p>
-      <w:pPr>
-        <w:spacing w:after="0"/>
-      </w:pPr>
-      <w:r>
-        <w:rPr>
-          <w:rFonts w:ascii="Segoe UI" w:cs="Segoe UI" w:eastAsia="Segoe UI" w:hAnsi="Segoe UI"/>
-          <w:b/>
-          <w:bCs/>
-          <w:sz w:val="21"/>
-          <w:szCs w:val="21"/>
-        </w:rPr>
-        <w:t xml:space="preserve">Student Name:</w:t>
-      </w:r>
-      <w:r>
-        <w:rPr>
-          <w:rFonts w:ascii="Segoe UI" w:cs="Segoe UI" w:eastAsia="Segoe UI" w:hAnsi="Segoe UI"/>
-          <w:sz w:val="21"/>
-          <w:szCs w:val="21"/>
-        </w:rPr>
-        <w:t xml:space="preserve"> ____________________</w:t>
-      </w:r>
-    </w:p>
-    <w:p>
-      <w:pPr>
-        <w:spacing w:after="0"/>
-      </w:pPr>
-      <w:r>
-        <w:rPr>
-          <w:rFonts w:ascii="Segoe UI" w:cs="Segoe UI" w:eastAsia="Segoe UI" w:hAnsi="Segoe UI"/>
-          <w:b/>
-          <w:bCs/>
-          <w:sz w:val="21"/>
-          <w:szCs w:val="21"/>
-        </w:rPr>
-        <w:t xml:space="preserve">USN:</w:t>
-      </w:r>
-      <w:r>
-        <w:rPr>
-          <w:rFonts w:ascii="Segoe UI" w:cs="Segoe UI" w:eastAsia="Segoe UI" w:hAnsi="Segoe UI"/>
-          <w:sz w:val="21"/>
-          <w:szCs w:val="21"/>
-        </w:rPr>
-        <w:t xml:space="preserve"> ____________________</w:t>
-      </w:r>
-    </w:p>
-    <w:p>
-      <w:pPr>
-        <w:spacing w:after="0"/>
-      </w:pPr>
-      <w:r>
-        <w:rPr>
-          <w:rFonts w:ascii="Segoe UI" w:cs="Segoe UI" w:eastAsia="Segoe UI" w:hAnsi="Segoe UI"/>
-          <w:b/>
-          <w:bCs/>
-          <w:i/>
-          <w:iCs/>
-          <w:sz w:val="21"/>
-          <w:szCs w:val="21"/>
-        </w:rPr>
-        <w:t xml:space="preserve">Semester / Section:</w:t>
-      </w:r>
-      <w:r>
-        <w:rPr>
-          <w:rFonts w:ascii="Segoe UI" w:cs="Segoe UI" w:eastAsia="Segoe UI" w:hAnsi="Segoe UI"/>
-          <w:sz w:val="21"/>
-          <w:szCs w:val="21"/>
-        </w:rPr>
-        <w:t xml:space="preserve"> ____________________</w:t>
-      </w:r>
-    </w:p>
-    <w:p>
-      <w:pPr>
-        <w:spacing w:after="0"/>
-      </w:pPr>
-      <w:r>
-        <w:rPr>
-          <w:rFonts w:ascii="Segoe UI" w:cs="Segoe UI" w:eastAsia="Segoe UI" w:hAnsi="Segoe UI"/>
-          <w:b/>
-          <w:bCs/>
-          <w:sz w:val="21"/>
-          <w:szCs w:val="21"/>
-        </w:rPr>
-        <w:t xml:space="preserve">Subject:</w:t>
-      </w:r>
-      <w:r>
-        <w:rPr>
-          <w:rFonts w:ascii="Segoe UI" w:cs="Segoe UI" w:eastAsia="Segoe UI" w:hAnsi="Segoe UI"/>
-          <w:sz w:val="21"/>
-          <w:szCs w:val="21"/>
-        </w:rPr>
-        <w:t xml:space="preserve"> ____________________</w:t>
-      </w:r>
-    </w:p>
-    <w:p>
-      <w:pPr>
-        <w:spacing w:after="240"/>
-      </w:pPr>
-      <w:r>
-        <w:rPr>
-          <w:rFonts w:ascii="Segoe UI" w:cs="Segoe UI" w:eastAsia="Segoe UI" w:hAnsi="Segoe UI"/>
-          <w:b/>
-          <w:bCs/>
-          <w:sz w:val="21"/>
-          <w:szCs w:val="21"/>
-        </w:rPr>
-        <w:t xml:space="preserve">Academic Year:</w:t>
-      </w:r>
-      <w:r>
-        <w:rPr>
-          <w:rFonts w:ascii="Segoe UI" w:cs="Segoe UI" w:eastAsia="Segoe UI" w:hAnsi="Segoe UI"/>
-          <w:sz w:val="21"/>
-          <w:szCs w:val="21"/>
-        </w:rPr>
-        <w:t xml:space="preserve"> 2026–27</w:t>
-      </w:r>
-    </w:p>
-    <w:p>
-      <w:pPr>
-        <w:spacing w:after="240"/>
-      </w:pPr>
-      <w:r>
-        <w:rPr>
-          <w:rFonts w:ascii="Segoe UI" w:cs="Segoe UI" w:eastAsia="Segoe UI" w:hAnsi="Segoe UI"/>
-          <w:b/>
-          <w:bCs/>
-          <w:sz w:val="21"/>
-          <w:szCs w:val="21"/>
-        </w:rPr>
-        <w:t xml:space="preserve">Project Title:</w:t>
-      </w:r>
-      <w:r>
-        <w:rPr>
-          <w:rFonts w:ascii="Segoe UI" w:cs="Segoe UI" w:eastAsia="Segoe UI" w:hAnsi="Segoe UI"/>
-          <w:sz w:val="21"/>
-          <w:szCs w:val="21"/>
-        </w:rPr>
-        <w:t xml:space="preserve"> Tagback: Privacy-Preserving QR Bag Tags for Lost-Item Recovery</w:t>
-      </w:r>
-    </w:p>
-    <w:p>
-      <w:pPr>
-        <w:spacing w:after="0"/>
-      </w:pPr>
-      <w:r>
-        <w:rPr>
-          <w:rFonts w:ascii="Segoe UI" w:cs="Segoe UI" w:eastAsia="Segoe UI" w:hAnsi="Segoe UI"/>
-          <w:b/>
-          <w:bCs/>
-          <w:sz w:val="21"/>
-          <w:szCs w:val="21"/>
-        </w:rPr>
-        <w:t xml:space="preserve">GitHub Repository Link:</w:t>
-      </w:r>
-      <w:r>
-        <w:rPr>
-          <w:rFonts w:ascii="Segoe UI" w:cs="Segoe UI" w:eastAsia="Segoe UI" w:hAnsi="Segoe UI"/>
-          <w:sz w:val="21"/>
-          <w:szCs w:val="21"/>
-        </w:rPr>
-        <w:t xml:space="preserve"> https://github.com/Jahnavi1110/bagtag</w:t>
-      </w:r>
-    </w:p>
-    <w:p>
-      <w:pPr>
-        <w:pBdr>
-          <w:bottom w:val="single" w:color="BFBFBF" w:sz="6" w:space="8"/>
-        </w:pBdr>
-        <w:spacing w:after="120" w:before="120"/>
-      </w:pPr>
+          <w:sz w:val="28"/>
+          <w:szCs w:val="28"/>
+        </w:rPr>
+        <w:t xml:space="preserve">Signature of Faculty</w:t>
+      </w:r>
     </w:p>
     <w:p>
       <w:pPr>
@@ -4615,70 +5113,7 @@
           <wp:inline distT="0" distB="0" distL="0" distR="0">
             <wp:extent cx="5334000" cy="3333750"/>
             <wp:effectExtent t="0" r="0" b="0" l="0"/>
-            <wp:docPr id="1" name="landing-desktop.png" descr="landing-desktop.png" title="landing-desktop.png"/>
-            <wp:cNvGraphicFramePr>
-              <a:graphicFrameLocks xmlns:a="http://schemas.openxmlformats.org/drawingml/2006/main" noChangeAspect="1"/>
-            </wp:cNvGraphicFramePr>
-            <a:graphic xmlns:a="http://schemas.openxmlformats.org/drawingml/2006/main">
-              <a:graphicData uri="http://schemas.openxmlformats.org/drawingml/2006/picture">
-                <pic:pic xmlns:pic="http://schemas.openxmlformats.org/drawingml/2006/picture">
-                  <pic:nvPicPr>
-                    <pic:cNvPr id="0" name="" descr=""/>
-                    <pic:cNvPicPr>
-                      <a:picLocks noChangeAspect="1" noChangeArrowheads="1"/>
-                    </pic:cNvPicPr>
-                  </pic:nvPicPr>
-                  <pic:blipFill>
-                    <a:blip r:embed="rId8" cstate="none"/>
-                    <a:srcRect/>
-                    <a:stretch>
-                      <a:fillRect/>
-                    </a:stretch>
-                  </pic:blipFill>
-                  <pic:spPr bwMode="auto">
-                    <a:xfrm>
-                      <a:off x="0" y="0"/>
-                      <a:ext cx="5334000" cy="3333750"/>
-                    </a:xfrm>
-                    <a:prstGeom prst="rect">
-                      <a:avLst/>
-                    </a:prstGeom>
-                  </pic:spPr>
-                </pic:pic>
-              </a:graphicData>
-            </a:graphic>
-          </wp:inline>
-        </w:drawing>
-      </w:r>
-    </w:p>
-    <w:p>
-      <w:pPr>
-        <w:keepNext/>
-        <w:spacing w:after="80" w:before="120"/>
-      </w:pPr>
-      <w:r>
-        <w:rPr>
-          <w:rFonts w:ascii="Segoe UI" w:cs="Segoe UI" w:eastAsia="Segoe UI" w:hAnsi="Segoe UI"/>
-          <w:b/>
-          <w:bCs/>
-          <w:sz w:val="21"/>
-          <w:szCs w:val="21"/>
-        </w:rPr>
-        <w:t xml:space="preserve">Figure 2: Owner dashboard listing tags with status badges, scan counts and unread messages</w:t>
-      </w:r>
-    </w:p>
-    <w:p>
-      <w:pPr>
-        <w:keepNext w:val="false"/>
-        <w:spacing w:after="240"/>
-        <w:jc w:val="center"/>
-      </w:pPr>
-      <w:r>
-        <w:drawing>
-          <wp:inline distT="0" distB="0" distL="0" distR="0">
-            <wp:extent cx="5334000" cy="3333750"/>
-            <wp:effectExtent t="0" r="0" b="0" l="0"/>
-            <wp:docPr id="2" name="dashboard.png" descr="dashboard.png" title="dashboard.png"/>
+            <wp:docPr id="2" name="landing-desktop.png" descr="landing-desktop.png" title="landing-desktop.png"/>
             <wp:cNvGraphicFramePr>
               <a:graphicFrameLocks xmlns:a="http://schemas.openxmlformats.org/drawingml/2006/main" noChangeAspect="1"/>
             </wp:cNvGraphicFramePr>
@@ -4727,7 +5162,7 @@
           <w:sz w:val="21"/>
           <w:szCs w:val="21"/>
         </w:rPr>
-        <w:t xml:space="preserve">Figure 3: Tag maker with live real-scale preview (school-bag label template)</w:t>
+        <w:t xml:space="preserve">Figure 2: Owner dashboard listing tags with status badges, scan counts and unread messages</w:t>
       </w:r>
     </w:p>
     <w:p>
@@ -4741,7 +5176,7 @@
           <wp:inline distT="0" distB="0" distL="0" distR="0">
             <wp:extent cx="5334000" cy="3333750"/>
             <wp:effectExtent t="0" r="0" b="0" l="0"/>
-            <wp:docPr id="3" name="tag-maker.png" descr="tag-maker.png" title="tag-maker.png"/>
+            <wp:docPr id="3" name="dashboard.png" descr="dashboard.png" title="dashboard.png"/>
             <wp:cNvGraphicFramePr>
               <a:graphicFrameLocks xmlns:a="http://schemas.openxmlformats.org/drawingml/2006/main" noChangeAspect="1"/>
             </wp:cNvGraphicFramePr>
@@ -4790,7 +5225,7 @@
           <w:sz w:val="21"/>
           <w:szCs w:val="21"/>
         </w:rPr>
-        <w:t xml:space="preserve">Figure 4: Exported PNG of a luggage tag (3× resolution) with the embedded QR code</w:t>
+        <w:t xml:space="preserve">Figure 3: Tag maker with live real-scale preview (school-bag label template)</w:t>
       </w:r>
     </w:p>
     <w:p>
@@ -4802,9 +5237,9 @@
       <w:r>
         <w:drawing>
           <wp:inline distT="0" distB="0" distL="0" distR="0">
-            <wp:extent cx="4000500" cy="2200275"/>
+            <wp:extent cx="5334000" cy="3333750"/>
             <wp:effectExtent t="0" r="0" b="0" l="0"/>
-            <wp:docPr id="4" name="tag-export.png" descr="tag-export.png" title="tag-export.png"/>
+            <wp:docPr id="4" name="tag-maker.png" descr="tag-maker.png" title="tag-maker.png"/>
             <wp:cNvGraphicFramePr>
               <a:graphicFrameLocks xmlns:a="http://schemas.openxmlformats.org/drawingml/2006/main" noChangeAspect="1"/>
             </wp:cNvGraphicFramePr>
@@ -4827,7 +5262,7 @@
                   <pic:spPr bwMode="auto">
                     <a:xfrm>
                       <a:off x="0" y="0"/>
-                      <a:ext cx="4000500" cy="2200275"/>
+                      <a:ext cx="5334000" cy="3333750"/>
                     </a:xfrm>
                     <a:prstGeom prst="rect">
                       <a:avLst/>
@@ -4853,7 +5288,7 @@
           <w:sz w:val="21"/>
           <w:szCs w:val="21"/>
         </w:rPr>
-        <w:t xml:space="preserve">Figure 5: Tag management page: export options, status controls and anonymous conversation with a finder</w:t>
+        <w:t xml:space="preserve">Figure 4: Exported PNG of a luggage tag (3× resolution) with the embedded QR code</w:t>
       </w:r>
     </w:p>
     <w:p>
@@ -4865,9 +5300,9 @@
       <w:r>
         <w:drawing>
           <wp:inline distT="0" distB="0" distL="0" distR="0">
-            <wp:extent cx="5334000" cy="3333750"/>
+            <wp:extent cx="4000500" cy="2200275"/>
             <wp:effectExtent t="0" r="0" b="0" l="0"/>
-            <wp:docPr id="5" name="owner-chat.png" descr="owner-chat.png" title="owner-chat.png"/>
+            <wp:docPr id="5" name="tag-export.png" descr="tag-export.png" title="tag-export.png"/>
             <wp:cNvGraphicFramePr>
               <a:graphicFrameLocks xmlns:a="http://schemas.openxmlformats.org/drawingml/2006/main" noChangeAspect="1"/>
             </wp:cNvGraphicFramePr>
@@ -4890,7 +5325,7 @@
                   <pic:spPr bwMode="auto">
                     <a:xfrm>
                       <a:off x="0" y="0"/>
-                      <a:ext cx="5334000" cy="3333750"/>
+                      <a:ext cx="4000500" cy="2200275"/>
                     </a:xfrm>
                     <a:prstGeom prst="rect">
                       <a:avLst/>
@@ -4916,7 +5351,7 @@
           <w:sz w:val="21"/>
           <w:szCs w:val="21"/>
         </w:rPr>
-        <w:t xml:space="preserve">Figure 6: Public finder page shown after scanning a tag</w:t>
+        <w:t xml:space="preserve">Figure 5: Tag management page: export options, status controls and anonymous conversation with a finder</w:t>
       </w:r>
     </w:p>
     <w:p>
@@ -4930,7 +5365,7 @@
           <wp:inline distT="0" distB="0" distL="0" distR="0">
             <wp:extent cx="5334000" cy="3333750"/>
             <wp:effectExtent t="0" r="0" b="0" l="0"/>
-            <wp:docPr id="6" name="finder-page.png" descr="finder-page.png" title="finder-page.png"/>
+            <wp:docPr id="6" name="owner-chat.png" descr="owner-chat.png" title="owner-chat.png"/>
             <wp:cNvGraphicFramePr>
               <a:graphicFrameLocks xmlns:a="http://schemas.openxmlformats.org/drawingml/2006/main" noChangeAspect="1"/>
             </wp:cNvGraphicFramePr>
@@ -4979,7 +5414,7 @@
           <w:sz w:val="21"/>
           <w:szCs w:val="21"/>
         </w:rPr>
-        <w:t xml:space="preserve">Figure 7: Finder page for an item reported as Lost, with the alert banner</w:t>
+        <w:t xml:space="preserve">Figure 6: Public finder page shown after scanning a tag</w:t>
       </w:r>
     </w:p>
     <w:p>
@@ -4993,7 +5428,7 @@
           <wp:inline distT="0" distB="0" distL="0" distR="0">
             <wp:extent cx="5334000" cy="3333750"/>
             <wp:effectExtent t="0" r="0" b="0" l="0"/>
-            <wp:docPr id="7" name="finder-lost.png" descr="finder-lost.png" title="finder-lost.png"/>
+            <wp:docPr id="7" name="finder-page.png" descr="finder-page.png" title="finder-page.png"/>
             <wp:cNvGraphicFramePr>
               <a:graphicFrameLocks xmlns:a="http://schemas.openxmlformats.org/drawingml/2006/main" noChangeAspect="1"/>
             </wp:cNvGraphicFramePr>
@@ -5042,7 +5477,7 @@
           <w:sz w:val="21"/>
           <w:szCs w:val="21"/>
         </w:rPr>
-        <w:t xml:space="preserve">Figure 8: Finder page on a mobile phone (390 × 844)</w:t>
+        <w:t xml:space="preserve">Figure 7: Finder page for an item reported as Lost, with the alert banner</w:t>
       </w:r>
     </w:p>
     <w:p>
@@ -5054,9 +5489,9 @@
       <w:r>
         <w:drawing>
           <wp:inline distT="0" distB="0" distL="0" distR="0">
-            <wp:extent cx="2028825" cy="4381500"/>
+            <wp:extent cx="5334000" cy="3333750"/>
             <wp:effectExtent t="0" r="0" b="0" l="0"/>
-            <wp:docPr id="8" name="finder-mobile.png" descr="finder-mobile.png" title="finder-mobile.png"/>
+            <wp:docPr id="8" name="finder-lost.png" descr="finder-lost.png" title="finder-lost.png"/>
             <wp:cNvGraphicFramePr>
               <a:graphicFrameLocks xmlns:a="http://schemas.openxmlformats.org/drawingml/2006/main" noChangeAspect="1"/>
             </wp:cNvGraphicFramePr>
@@ -5079,7 +5514,7 @@
                   <pic:spPr bwMode="auto">
                     <a:xfrm>
                       <a:off x="0" y="0"/>
-                      <a:ext cx="2028825" cy="4381500"/>
+                      <a:ext cx="5334000" cy="3333750"/>
                     </a:xfrm>
                     <a:prstGeom prst="rect">
                       <a:avLst/>
@@ -5105,21 +5540,21 @@
           <w:sz w:val="21"/>
           <w:szCs w:val="21"/>
         </w:rPr>
-        <w:t xml:space="preserve">Figure 9: Tagby's moods on the finder page: worried for a Lost item (top) and celebrating for a Found item (bottom)</w:t>
-      </w:r>
-    </w:p>
-    <w:p>
-      <w:pPr>
-        <w:keepNext/>
+        <w:t xml:space="preserve">Figure 8: Finder page on a mobile phone (390 × 844)</w:t>
+      </w:r>
+    </w:p>
+    <w:p>
+      <w:pPr>
+        <w:keepNext w:val="false"/>
         <w:spacing w:after="240"/>
         <w:jc w:val="center"/>
       </w:pPr>
       <w:r>
         <w:drawing>
           <wp:inline distT="0" distB="0" distL="0" distR="0">
-            <wp:extent cx="4191000" cy="2619375"/>
+            <wp:extent cx="2028825" cy="4381500"/>
             <wp:effectExtent t="0" r="0" b="0" l="0"/>
-            <wp:docPr id="9" name="finder-lost-tagby.png" descr="finder-lost-tagby.png" title="finder-lost-tagby.png"/>
+            <wp:docPr id="9" name="finder-mobile.png" descr="finder-mobile.png" title="finder-mobile.png"/>
             <wp:cNvGraphicFramePr>
               <a:graphicFrameLocks xmlns:a="http://schemas.openxmlformats.org/drawingml/2006/main" noChangeAspect="1"/>
             </wp:cNvGraphicFramePr>
@@ -5142,7 +5577,7 @@
                   <pic:spPr bwMode="auto">
                     <a:xfrm>
                       <a:off x="0" y="0"/>
-                      <a:ext cx="4191000" cy="2619375"/>
+                      <a:ext cx="2028825" cy="4381500"/>
                     </a:xfrm>
                     <a:prstGeom prst="rect">
                       <a:avLst/>
@@ -5157,7 +5592,23 @@
     </w:p>
     <w:p>
       <w:pPr>
-        <w:keepNext w:val="false"/>
+        <w:keepNext/>
+        <w:spacing w:after="80" w:before="120"/>
+      </w:pPr>
+      <w:r>
+        <w:rPr>
+          <w:rFonts w:ascii="Segoe UI" w:cs="Segoe UI" w:eastAsia="Segoe UI" w:hAnsi="Segoe UI"/>
+          <w:b/>
+          <w:bCs/>
+          <w:sz w:val="21"/>
+          <w:szCs w:val="21"/>
+        </w:rPr>
+        <w:t xml:space="preserve">Figure 9: Tagby's moods on the finder page: worried for a Lost item (top) and celebrating for a Found item (bottom)</w:t>
+      </w:r>
+    </w:p>
+    <w:p>
+      <w:pPr>
+        <w:keepNext/>
         <w:spacing w:after="240"/>
         <w:jc w:val="center"/>
       </w:pPr>
@@ -5166,7 +5617,7 @@
           <wp:inline distT="0" distB="0" distL="0" distR="0">
             <wp:extent cx="4191000" cy="2619375"/>
             <wp:effectExtent t="0" r="0" b="0" l="0"/>
-            <wp:docPr id="10" name="finder-found-tagby.png" descr="finder-found-tagby.png" title="finder-found-tagby.png"/>
+            <wp:docPr id="10" name="finder-lost-tagby.png" descr="finder-lost-tagby.png" title="finder-lost-tagby.png"/>
             <wp:cNvGraphicFramePr>
               <a:graphicFrameLocks xmlns:a="http://schemas.openxmlformats.org/drawingml/2006/main" noChangeAspect="1"/>
             </wp:cNvGraphicFramePr>
@@ -5204,22 +5655,6 @@
     </w:p>
     <w:p>
       <w:pPr>
-        <w:keepNext/>
-        <w:spacing w:after="80" w:before="120"/>
-      </w:pPr>
-      <w:r>
-        <w:rPr>
-          <w:rFonts w:ascii="Segoe UI" w:cs="Segoe UI" w:eastAsia="Segoe UI" w:hAnsi="Segoe UI"/>
-          <w:b/>
-          <w:bCs/>
-          <w:sz w:val="21"/>
-          <w:szCs w:val="21"/>
-        </w:rPr>
-        <w:t xml:space="preserve">Figure 10: A4 print sheet with several tags at real size</w:t>
-      </w:r>
-    </w:p>
-    <w:p>
-      <w:pPr>
         <w:keepNext w:val="false"/>
         <w:spacing w:after="240"/>
         <w:jc w:val="center"/>
@@ -5227,9 +5662,9 @@
       <w:r>
         <w:drawing>
           <wp:inline distT="0" distB="0" distL="0" distR="0">
-            <wp:extent cx="5334000" cy="3333750"/>
+            <wp:extent cx="4191000" cy="2619375"/>
             <wp:effectExtent t="0" r="0" b="0" l="0"/>
-            <wp:docPr id="11" name="print-sheet.png" descr="print-sheet.png" title="print-sheet.png"/>
+            <wp:docPr id="11" name="finder-found-tagby.png" descr="finder-found-tagby.png" title="finder-found-tagby.png"/>
             <wp:cNvGraphicFramePr>
               <a:graphicFrameLocks xmlns:a="http://schemas.openxmlformats.org/drawingml/2006/main" noChangeAspect="1"/>
             </wp:cNvGraphicFramePr>
@@ -5252,7 +5687,7 @@
                   <pic:spPr bwMode="auto">
                     <a:xfrm>
                       <a:off x="0" y="0"/>
-                      <a:ext cx="5334000" cy="3333750"/>
+                      <a:ext cx="4191000" cy="2619375"/>
                     </a:xfrm>
                     <a:prstGeom prst="rect">
                       <a:avLst/>
@@ -5278,7 +5713,7 @@
           <w:sz w:val="21"/>
           <w:szCs w:val="21"/>
         </w:rPr>
-        <w:t xml:space="preserve">Figure 11: Login page</w:t>
+        <w:t xml:space="preserve">Figure 10: A4 print sheet with several tags at real size</w:t>
       </w:r>
     </w:p>
     <w:p>
@@ -5292,7 +5727,7 @@
           <wp:inline distT="0" distB="0" distL="0" distR="0">
             <wp:extent cx="5334000" cy="3333750"/>
             <wp:effectExtent t="0" r="0" b="0" l="0"/>
-            <wp:docPr id="12" name="login.png" descr="login.png" title="login.png"/>
+            <wp:docPr id="12" name="print-sheet.png" descr="print-sheet.png" title="print-sheet.png"/>
             <wp:cNvGraphicFramePr>
               <a:graphicFrameLocks xmlns:a="http://schemas.openxmlformats.org/drawingml/2006/main" noChangeAspect="1"/>
             </wp:cNvGraphicFramePr>
@@ -5330,73 +5765,18 @@
     </w:p>
     <w:p>
       <w:pPr>
-        <w:pBdr>
-          <w:bottom w:val="single" w:color="BFBFBF" w:sz="6" w:space="8"/>
-        </w:pBdr>
-        <w:spacing w:after="120" w:before="120"/>
-      </w:pPr>
-    </w:p>
-    <w:p>
-      <w:pPr>
-        <w:keepNext/>
-        <w:spacing w:after="200" w:before="360"/>
+        <w:keepNext/>
+        <w:spacing w:after="80" w:before="120"/>
       </w:pPr>
       <w:r>
         <w:rPr>
           <w:rFonts w:ascii="Segoe UI" w:cs="Segoe UI" w:eastAsia="Segoe UI" w:hAnsi="Segoe UI"/>
           <w:b/>
           <w:bCs/>
-          <w:sz w:val="30"/>
-          <w:szCs w:val="30"/>
-        </w:rPr>
-        <w:t xml:space="preserve">8. GITHUB REPOSITORY SCREENSHOT AND LINK</w:t>
-      </w:r>
-    </w:p>
-    <w:p>
-      <w:pPr>
-        <w:spacing w:after="120"/>
-      </w:pPr>
-      <w:r>
-        <w:rPr>
-          <w:rFonts w:ascii="Segoe UI" w:cs="Segoe UI" w:eastAsia="Segoe UI" w:hAnsi="Segoe UI"/>
-          <w:b/>
-          <w:bCs/>
-          <w:sz w:val="21"/>
-          <w:szCs w:val="21"/>
-        </w:rPr>
-        <w:t xml:space="preserve">GitHub Repository Link:</w:t>
-      </w:r>
-      <w:r>
-        <w:rPr>
-          <w:rFonts w:ascii="Segoe UI" w:cs="Segoe UI" w:eastAsia="Segoe UI" w:hAnsi="Segoe UI"/>
-          <w:sz w:val="21"/>
-          <w:szCs w:val="21"/>
-        </w:rPr>
-        <w:t xml:space="preserve"> https://github.com/Jahnavi1110/bagtag</w:t>
-      </w:r>
-    </w:p>
-    <w:p>
-      <w:pPr>
-        <w:pBdr>
-          <w:bottom w:val="single" w:color="BFBFBF" w:sz="6" w:space="8"/>
-        </w:pBdr>
-        <w:spacing w:after="120" w:before="120"/>
-      </w:pPr>
-    </w:p>
-    <w:p>
-      <w:pPr>
-        <w:keepNext/>
-        <w:spacing w:after="80" w:before="120"/>
-      </w:pPr>
-      <w:r>
-        <w:rPr>
-          <w:rFonts w:ascii="Segoe UI" w:cs="Segoe UI" w:eastAsia="Segoe UI" w:hAnsi="Segoe UI"/>
-          <w:b/>
-          <w:bCs/>
-          <w:sz w:val="21"/>
-          <w:szCs w:val="21"/>
-        </w:rPr>
-        <w:t xml:space="preserve">Repository Screenshot:</w:t>
+          <w:sz w:val="21"/>
+          <w:szCs w:val="21"/>
+        </w:rPr>
+        <w:t xml:space="preserve">Figure 11: Login page</w:t>
       </w:r>
     </w:p>
     <w:p>
@@ -5408,9 +5788,9 @@
       <w:r>
         <w:drawing>
           <wp:inline distT="0" distB="0" distL="0" distR="0">
-            <wp:extent cx="4762500" cy="2981325"/>
+            <wp:extent cx="5334000" cy="3333750"/>
             <wp:effectExtent t="0" r="0" b="0" l="0"/>
-            <wp:docPr id="13" name="github-repo.png" descr="github-repo.png" title="github-repo.png"/>
+            <wp:docPr id="13" name="login.png" descr="login.png" title="login.png"/>
             <wp:cNvGraphicFramePr>
               <a:graphicFrameLocks xmlns:a="http://schemas.openxmlformats.org/drawingml/2006/main" noChangeAspect="1"/>
             </wp:cNvGraphicFramePr>
@@ -5433,6 +5813,124 @@
                   <pic:spPr bwMode="auto">
                     <a:xfrm>
                       <a:off x="0" y="0"/>
+                      <a:ext cx="5334000" cy="3333750"/>
+                    </a:xfrm>
+                    <a:prstGeom prst="rect">
+                      <a:avLst/>
+                    </a:prstGeom>
+                  </pic:spPr>
+                </pic:pic>
+              </a:graphicData>
+            </a:graphic>
+          </wp:inline>
+        </w:drawing>
+      </w:r>
+    </w:p>
+    <w:p>
+      <w:pPr>
+        <w:pBdr>
+          <w:bottom w:val="single" w:color="BFBFBF" w:sz="6" w:space="8"/>
+        </w:pBdr>
+        <w:spacing w:after="120" w:before="120"/>
+      </w:pPr>
+    </w:p>
+    <w:p>
+      <w:pPr>
+        <w:keepNext/>
+        <w:spacing w:after="200" w:before="360"/>
+      </w:pPr>
+      <w:r>
+        <w:rPr>
+          <w:rFonts w:ascii="Segoe UI" w:cs="Segoe UI" w:eastAsia="Segoe UI" w:hAnsi="Segoe UI"/>
+          <w:b/>
+          <w:bCs/>
+          <w:sz w:val="30"/>
+          <w:szCs w:val="30"/>
+        </w:rPr>
+        <w:t xml:space="preserve">8. GITHUB REPOSITORY SCREENSHOT AND LINK</w:t>
+      </w:r>
+    </w:p>
+    <w:p>
+      <w:pPr>
+        <w:spacing w:after="120"/>
+      </w:pPr>
+      <w:r>
+        <w:rPr>
+          <w:rFonts w:ascii="Segoe UI" w:cs="Segoe UI" w:eastAsia="Segoe UI" w:hAnsi="Segoe UI"/>
+          <w:b/>
+          <w:bCs/>
+          <w:sz w:val="21"/>
+          <w:szCs w:val="21"/>
+        </w:rPr>
+        <w:t xml:space="preserve">GitHub Repository Link:</w:t>
+      </w:r>
+      <w:r>
+        <w:rPr>
+          <w:rFonts w:ascii="Segoe UI" w:cs="Segoe UI" w:eastAsia="Segoe UI" w:hAnsi="Segoe UI"/>
+          <w:sz w:val="21"/>
+          <w:szCs w:val="21"/>
+        </w:rPr>
+        <w:t xml:space="preserve"> https://github.com/Jahnavi1110/bagtag</w:t>
+      </w:r>
+    </w:p>
+    <w:p>
+      <w:pPr>
+        <w:pBdr>
+          <w:bottom w:val="single" w:color="BFBFBF" w:sz="6" w:space="8"/>
+        </w:pBdr>
+        <w:spacing w:after="120" w:before="120"/>
+      </w:pPr>
+    </w:p>
+    <w:p>
+      <w:pPr>
+        <w:keepNext/>
+        <w:spacing w:after="80" w:before="120"/>
+      </w:pPr>
+      <w:r>
+        <w:rPr>
+          <w:rFonts w:ascii="Segoe UI" w:cs="Segoe UI" w:eastAsia="Segoe UI" w:hAnsi="Segoe UI"/>
+          <w:b/>
+          <w:bCs/>
+          <w:sz w:val="21"/>
+          <w:szCs w:val="21"/>
+        </w:rPr>
+        <w:t xml:space="preserve">Repository Screenshot:</w:t>
+      </w:r>
+    </w:p>
+    <w:p>
+      <w:pPr>
+        <w:keepNext w:val="false"/>
+        <w:spacing w:after="240"/>
+        <w:jc w:val="center"/>
+      </w:pPr>
+      <w:r>
+        <w:drawing>
+          <wp:inline distT="0" distB="0" distL="0" distR="0">
+            <wp:extent cx="4762500" cy="2981325"/>
+            <wp:effectExtent t="0" r="0" b="0" l="0"/>
+            <wp:docPr id="14" name="github-repo.png" descr="github-repo.png" title="github-repo.png"/>
+            <wp:cNvGraphicFramePr>
+              <a:graphicFrameLocks xmlns:a="http://schemas.openxmlformats.org/drawingml/2006/main" noChangeAspect="1"/>
+            </wp:cNvGraphicFramePr>
+            <a:graphic xmlns:a="http://schemas.openxmlformats.org/drawingml/2006/main">
+              <a:graphicData uri="http://schemas.openxmlformats.org/drawingml/2006/picture">
+                <pic:pic xmlns:pic="http://schemas.openxmlformats.org/drawingml/2006/picture">
+                  <pic:nvPicPr>
+                    <pic:cNvPr id="0" name="" descr=""/>
+                    <pic:cNvPicPr>
+                      <a:picLocks noChangeAspect="1" noChangeArrowheads="1"/>
+                    </pic:cNvPicPr>
+                  </pic:nvPicPr>
+                  <pic:blipFill>
+                    <a:blip r:embed="rId21" cstate="none"/>
+                    <a:srcRect/>
+                    <a:stretch>
+                      <a:fillRect/>
+                    </a:stretch>
+                  </pic:blipFill>
+                  <pic:spPr bwMode="auto">
+                    <a:xfrm>
+                      <a:off x="0" y="0"/>
                       <a:ext cx="4762500" cy="2981325"/>
                     </a:xfrm>
                     <a:prstGeom prst="rect">
@@ -5469,7 +5967,7 @@
           <w:sz w:val="21"/>
           <w:szCs w:val="21"/>
         </w:rPr>
-        <w:t xml:space="preserve">The README.md file describes the project and its problem statement, objectives and features. It includes a technology table, a Mermaid architecture diagram, the database schema, a detailed privacy model, an API route table, the project structure, setup steps (npm install, npm run seed, npm run dev), testing instructions, screenshots, design decisions, challenges, known limitations, future work and the MIT licence. It also states that the project was built with Claude Code. The Git history uses conventional commits that follow the build phases (chore, feat(db), feat(auth), feat(tags), feat(export), feat(finder), feat(chat), test, fix(tags), docs), starting with "chore: scaffold Next.js, TypeScript, Tailwind and tooling".</w:t>
+        <w:t xml:space="preserve">The README.md file describes the project and its problem statement, objectives and features. It includes a technology table, a Mermaid architecture diagram, the database schema, a detailed privacy model, an API route table, the project structure, setup steps (npm install, npm run seed, npm run dev), testing instructions, screenshots, design decisions, challenges, known limitations, future work and the MIT licence. It also states that the project was built with Claude Code. The Git history uses conventional commits that follow the build phases (chore, feat(db), feat(auth), feat(tags), feat(export), feat(finder), feat(chat), test, fix(tags), docs, feat(ui)), starting with "chore: scaffold Next.js, TypeScript, Tailwind and tooling".</w:t>
       </w:r>
     </w:p>
     <w:p>
@@ -5972,7 +6470,7 @@
       <w:footerReference w:type="default" r:id="rId6"/>
       <w:pgSz w:w="12240" w:h="15840" w:orient="portrait"/>
       <w:pgMar w:top="1440" w:right="1560" w:bottom="1440" w:left="1560" w:header="708" w:footer="708" w:gutter="0"/>
-      <w:pgNumType/>
+      <w:pgNumType w:start="1"/>
       <w:docGrid w:linePitch="360"/>
     </w:sectPr>
   </w:body>

</xml_diff>